<commit_message>
Update to correct some misnamed files
</commit_message>
<xml_diff>
--- a/docs/ResearchOne - Work Order K.docx
+++ b/docs/ResearchOne - Work Order K.docx
@@ -4,1502 +4,1547 @@
   <w:body>
     <w:p>
       <w:pPr>
-        <w:spacing w:after="0" w:line="240" w:lineRule="auto"/>
-        <w:rPr>
-          <w:b/>
-          <w:bCs/>
-          <w:sz w:val="14"/>
-          <w:szCs w:val="14"/>
-        </w:rPr>
-      </w:pPr>
-      <w:r>
-        <w:rPr>
-          <w:b/>
-          <w:bCs/>
-          <w:sz w:val="14"/>
-          <w:szCs w:val="14"/>
-        </w:rPr>
-        <w:t>Work Order J — Enterprise single-tenant routing abstraction</w:t>
-      </w:r>
+        <w:rPr>
+          <w:b/>
+          <w:bCs/>
+          <w:sz w:val="14"/>
+          <w:szCs w:val="14"/>
+        </w:rPr>
+      </w:pPr>
+      <w:bookmarkStart w:id="0" w:name="_Toc228906726"/>
+      <w:bookmarkStart w:id="1" w:name="X2c8ba9e92804a06743935b9f42159d4b078fdb6"/>
+      <w:r>
+        <w:rPr>
+          <w:b/>
+          <w:bCs/>
+          <w:sz w:val="14"/>
+          <w:szCs w:val="14"/>
+        </w:rPr>
+        <w:t>Work Order K — RLS migration and shared DB isolation</w:t>
+      </w:r>
+      <w:bookmarkEnd w:id="0"/>
     </w:p>
     <w:p>
       <w:pPr>
-        <w:spacing w:after="0" w:line="240" w:lineRule="auto"/>
-        <w:rPr>
-          <w:b/>
-          <w:bCs/>
-          <w:sz w:val="14"/>
-          <w:szCs w:val="14"/>
-        </w:rPr>
-      </w:pPr>
-      <w:r>
-        <w:rPr>
-          <w:b/>
-          <w:bCs/>
-          <w:sz w:val="14"/>
-          <w:szCs w:val="14"/>
-        </w:rPr>
-        <w:t>Goal. Establish the abstraction that allows Sovereign customers to be deployed on dedicated infrastructure, with the InTellMe ingestion client compile-time excluded.</w:t>
+        <w:rPr>
+          <w:b/>
+          <w:bCs/>
+          <w:sz w:val="14"/>
+          <w:szCs w:val="14"/>
+        </w:rPr>
+      </w:pPr>
+      <w:r>
+        <w:rPr>
+          <w:b/>
+          <w:bCs/>
+          <w:sz w:val="14"/>
+          <w:szCs w:val="14"/>
+        </w:rPr>
+        <w:t>Goal. Add row-level security to every customer-data table on shared B2C database per Section 8 and Section 9.</w:t>
       </w:r>
     </w:p>
     <w:p>
       <w:pPr>
-        <w:spacing w:after="0" w:line="240" w:lineRule="auto"/>
-        <w:rPr>
-          <w:b/>
-          <w:bCs/>
-          <w:sz w:val="14"/>
-          <w:szCs w:val="14"/>
-        </w:rPr>
-      </w:pPr>
-      <w:r>
-        <w:rPr>
-          <w:b/>
-          <w:bCs/>
-          <w:sz w:val="14"/>
-          <w:szCs w:val="14"/>
-        </w:rPr>
-        <w:t>Pre-work — read first:</w:t>
+        <w:rPr>
+          <w:b/>
+          <w:bCs/>
+          <w:sz w:val="14"/>
+          <w:szCs w:val="14"/>
+        </w:rPr>
+      </w:pPr>
+      <w:r>
+        <w:rPr>
+          <w:b/>
+          <w:bCs/>
+          <w:sz w:val="14"/>
+          <w:szCs w:val="14"/>
+        </w:rPr>
+        <w:t>Pre-work: Section 8 (RLS policies), Work Order A schema inventory (every table to RLS-protect), PostgreSQL RLS docs.</w:t>
       </w:r>
     </w:p>
     <w:p>
       <w:pPr>
+        <w:rPr>
+          <w:b/>
+          <w:bCs/>
+          <w:sz w:val="14"/>
+          <w:szCs w:val="14"/>
+        </w:rPr>
+      </w:pPr>
+      <w:r>
+        <w:rPr>
+          <w:b/>
+          <w:bCs/>
+          <w:sz w:val="14"/>
+          <w:szCs w:val="14"/>
+        </w:rPr>
+        <w:t>Files to create:</w:t>
+      </w:r>
+    </w:p>
+    <w:p>
+      <w:pPr>
         <w:numPr>
           <w:ilvl w:val="0"/>
-          <w:numId w:val="53"/>
+          <w:numId w:val="61"/>
         </w:numPr>
-        <w:spacing w:after="0" w:line="240" w:lineRule="auto"/>
-        <w:rPr>
-          <w:b/>
-          <w:bCs/>
-          <w:sz w:val="14"/>
-          <w:szCs w:val="14"/>
-        </w:rPr>
-      </w:pPr>
-      <w:r>
-        <w:rPr>
-          <w:b/>
-          <w:bCs/>
-          <w:sz w:val="14"/>
-          <w:szCs w:val="14"/>
-        </w:rPr>
-        <w:t>This report Section 8 (Sovereign opt-out enforcement, three-layer defense)</w:t>
+        <w:rPr>
+          <w:b/>
+          <w:bCs/>
+          <w:sz w:val="14"/>
+          <w:szCs w:val="14"/>
+        </w:rPr>
+      </w:pPr>
+      <w:r>
+        <w:rPr>
+          <w:b/>
+          <w:bCs/>
+          <w:sz w:val="14"/>
+          <w:szCs w:val="14"/>
+        </w:rPr>
+        <w:t>backend/</w:t>
+      </w:r>
+      <w:proofErr w:type="spellStart"/>
+      <w:r>
+        <w:rPr>
+          <w:b/>
+          <w:bCs/>
+          <w:sz w:val="14"/>
+          <w:szCs w:val="14"/>
+        </w:rPr>
+        <w:t>src</w:t>
+      </w:r>
+      <w:proofErr w:type="spellEnd"/>
+      <w:r>
+        <w:rPr>
+          <w:b/>
+          <w:bCs/>
+          <w:sz w:val="14"/>
+          <w:szCs w:val="14"/>
+        </w:rPr>
+        <w:t>/</w:t>
+      </w:r>
+      <w:proofErr w:type="spellStart"/>
+      <w:r>
+        <w:rPr>
+          <w:b/>
+          <w:bCs/>
+          <w:sz w:val="14"/>
+          <w:szCs w:val="14"/>
+        </w:rPr>
+        <w:t>db</w:t>
+      </w:r>
+      <w:proofErr w:type="spellEnd"/>
+      <w:r>
+        <w:rPr>
+          <w:b/>
+          <w:bCs/>
+          <w:sz w:val="14"/>
+          <w:szCs w:val="14"/>
+        </w:rPr>
+        <w:t>/migrations/20260XXX_rls_setup.sql:</w:t>
       </w:r>
     </w:p>
     <w:p>
       <w:pPr>
+        <w:rPr>
+          <w:b/>
+          <w:bCs/>
+          <w:sz w:val="14"/>
+          <w:szCs w:val="14"/>
+        </w:rPr>
+      </w:pPr>
+      <w:r>
+        <w:rPr>
+          <w:b/>
+          <w:bCs/>
+          <w:sz w:val="14"/>
+          <w:szCs w:val="14"/>
+        </w:rPr>
+        <w:t xml:space="preserve">CREATE ROLE </w:t>
+      </w:r>
+      <w:proofErr w:type="spellStart"/>
+      <w:r>
+        <w:rPr>
+          <w:b/>
+          <w:bCs/>
+          <w:sz w:val="14"/>
+          <w:szCs w:val="14"/>
+        </w:rPr>
+        <w:t>application_role</w:t>
+      </w:r>
+      <w:proofErr w:type="spellEnd"/>
+      <w:r>
+        <w:rPr>
+          <w:b/>
+          <w:bCs/>
+          <w:sz w:val="14"/>
+          <w:szCs w:val="14"/>
+        </w:rPr>
+        <w:t xml:space="preserve"> NOINHERIT;</w:t>
+      </w:r>
+      <w:r>
+        <w:rPr>
+          <w:b/>
+          <w:bCs/>
+          <w:sz w:val="14"/>
+          <w:szCs w:val="14"/>
+        </w:rPr>
+        <w:br/>
+        <w:t xml:space="preserve">GRANT USAGE ON SCHEMA public TO </w:t>
+      </w:r>
+      <w:proofErr w:type="spellStart"/>
+      <w:r>
+        <w:rPr>
+          <w:b/>
+          <w:bCs/>
+          <w:sz w:val="14"/>
+          <w:szCs w:val="14"/>
+        </w:rPr>
+        <w:t>application_role</w:t>
+      </w:r>
+      <w:proofErr w:type="spellEnd"/>
+      <w:r>
+        <w:rPr>
+          <w:b/>
+          <w:bCs/>
+          <w:sz w:val="14"/>
+          <w:szCs w:val="14"/>
+        </w:rPr>
+        <w:t>;</w:t>
+      </w:r>
+      <w:r>
+        <w:rPr>
+          <w:b/>
+          <w:bCs/>
+          <w:sz w:val="14"/>
+          <w:szCs w:val="14"/>
+        </w:rPr>
+        <w:br/>
+        <w:t xml:space="preserve">GRANT SELECT, INSERT, UPDATE, DELETE ON ALL TABLES IN SCHEMA public TO </w:t>
+      </w:r>
+      <w:proofErr w:type="spellStart"/>
+      <w:r>
+        <w:rPr>
+          <w:b/>
+          <w:bCs/>
+          <w:sz w:val="14"/>
+          <w:szCs w:val="14"/>
+        </w:rPr>
+        <w:t>application_role</w:t>
+      </w:r>
+      <w:proofErr w:type="spellEnd"/>
+      <w:r>
+        <w:rPr>
+          <w:b/>
+          <w:bCs/>
+          <w:sz w:val="14"/>
+          <w:szCs w:val="14"/>
+        </w:rPr>
+        <w:t>;</w:t>
+      </w:r>
+      <w:r>
+        <w:rPr>
+          <w:b/>
+          <w:bCs/>
+          <w:sz w:val="14"/>
+          <w:szCs w:val="14"/>
+        </w:rPr>
+        <w:br/>
+        <w:t>ALTER DEFAULT PRIVILEGES IN SCHEMA public</w:t>
+      </w:r>
+      <w:r>
+        <w:rPr>
+          <w:b/>
+          <w:bCs/>
+          <w:sz w:val="14"/>
+          <w:szCs w:val="14"/>
+        </w:rPr>
+        <w:br/>
+        <w:t xml:space="preserve">  GRANT SELECT, INSERT, UPDATE, DELETE ON TABLES TO </w:t>
+      </w:r>
+      <w:proofErr w:type="spellStart"/>
+      <w:r>
+        <w:rPr>
+          <w:b/>
+          <w:bCs/>
+          <w:sz w:val="14"/>
+          <w:szCs w:val="14"/>
+        </w:rPr>
+        <w:t>application_role</w:t>
+      </w:r>
+      <w:proofErr w:type="spellEnd"/>
+      <w:r>
+        <w:rPr>
+          <w:b/>
+          <w:bCs/>
+          <w:sz w:val="14"/>
+          <w:szCs w:val="14"/>
+        </w:rPr>
+        <w:t>;</w:t>
+      </w:r>
+      <w:r>
+        <w:rPr>
+          <w:b/>
+          <w:bCs/>
+          <w:sz w:val="14"/>
+          <w:szCs w:val="14"/>
+        </w:rPr>
+        <w:br/>
+      </w:r>
+      <w:r>
+        <w:rPr>
+          <w:b/>
+          <w:bCs/>
+          <w:sz w:val="14"/>
+          <w:szCs w:val="14"/>
+        </w:rPr>
+        <w:br/>
+      </w:r>
+      <w:r>
+        <w:rPr>
+          <w:b/>
+          <w:bCs/>
+          <w:i/>
+          <w:sz w:val="14"/>
+          <w:szCs w:val="14"/>
+        </w:rPr>
+        <w:t>-- Append-only on critical tables</w:t>
+      </w:r>
+      <w:r>
+        <w:rPr>
+          <w:b/>
+          <w:bCs/>
+          <w:sz w:val="14"/>
+          <w:szCs w:val="14"/>
+        </w:rPr>
+        <w:br/>
+        <w:t xml:space="preserve">REVOKE UPDATE, DELETE ON </w:t>
+      </w:r>
+      <w:proofErr w:type="spellStart"/>
+      <w:r>
+        <w:rPr>
+          <w:b/>
+          <w:bCs/>
+          <w:sz w:val="14"/>
+          <w:szCs w:val="14"/>
+        </w:rPr>
+        <w:t>wallet_ledger</w:t>
+      </w:r>
+      <w:proofErr w:type="spellEnd"/>
+      <w:r>
+        <w:rPr>
+          <w:b/>
+          <w:bCs/>
+          <w:sz w:val="14"/>
+          <w:szCs w:val="14"/>
+        </w:rPr>
+        <w:t xml:space="preserve"> FROM </w:t>
+      </w:r>
+      <w:proofErr w:type="spellStart"/>
+      <w:r>
+        <w:rPr>
+          <w:b/>
+          <w:bCs/>
+          <w:sz w:val="14"/>
+          <w:szCs w:val="14"/>
+        </w:rPr>
+        <w:t>application_role</w:t>
+      </w:r>
+      <w:proofErr w:type="spellEnd"/>
+      <w:r>
+        <w:rPr>
+          <w:b/>
+          <w:bCs/>
+          <w:sz w:val="14"/>
+          <w:szCs w:val="14"/>
+        </w:rPr>
+        <w:t>;</w:t>
+      </w:r>
+      <w:r>
+        <w:rPr>
+          <w:b/>
+          <w:bCs/>
+          <w:sz w:val="14"/>
+          <w:szCs w:val="14"/>
+        </w:rPr>
+        <w:br/>
+        <w:t xml:space="preserve">REVOKE UPDATE, DELETE ON </w:t>
+      </w:r>
+      <w:proofErr w:type="spellStart"/>
+      <w:r>
+        <w:rPr>
+          <w:b/>
+          <w:bCs/>
+          <w:sz w:val="14"/>
+          <w:szCs w:val="14"/>
+        </w:rPr>
+        <w:t>ingestion_audit_log</w:t>
+      </w:r>
+      <w:proofErr w:type="spellEnd"/>
+      <w:r>
+        <w:rPr>
+          <w:b/>
+          <w:bCs/>
+          <w:sz w:val="14"/>
+          <w:szCs w:val="14"/>
+        </w:rPr>
+        <w:t xml:space="preserve"> FROM </w:t>
+      </w:r>
+      <w:proofErr w:type="spellStart"/>
+      <w:r>
+        <w:rPr>
+          <w:b/>
+          <w:bCs/>
+          <w:sz w:val="14"/>
+          <w:szCs w:val="14"/>
+        </w:rPr>
+        <w:t>application_role</w:t>
+      </w:r>
+      <w:proofErr w:type="spellEnd"/>
+      <w:r>
+        <w:rPr>
+          <w:b/>
+          <w:bCs/>
+          <w:sz w:val="14"/>
+          <w:szCs w:val="14"/>
+        </w:rPr>
+        <w:t>;</w:t>
+      </w:r>
+      <w:r>
+        <w:rPr>
+          <w:b/>
+          <w:bCs/>
+          <w:sz w:val="14"/>
+          <w:szCs w:val="14"/>
+        </w:rPr>
+        <w:br/>
+        <w:t xml:space="preserve">REVOKE UPDATE, DELETE ON </w:t>
+      </w:r>
+      <w:proofErr w:type="spellStart"/>
+      <w:r>
+        <w:rPr>
+          <w:b/>
+          <w:bCs/>
+          <w:sz w:val="14"/>
+          <w:szCs w:val="14"/>
+        </w:rPr>
+        <w:t>stripe_webhook_events</w:t>
+      </w:r>
+      <w:proofErr w:type="spellEnd"/>
+      <w:r>
+        <w:rPr>
+          <w:b/>
+          <w:bCs/>
+          <w:sz w:val="14"/>
+          <w:szCs w:val="14"/>
+        </w:rPr>
+        <w:t xml:space="preserve"> FROM </w:t>
+      </w:r>
+      <w:proofErr w:type="spellStart"/>
+      <w:r>
+        <w:rPr>
+          <w:b/>
+          <w:bCs/>
+          <w:sz w:val="14"/>
+          <w:szCs w:val="14"/>
+        </w:rPr>
+        <w:t>application_role</w:t>
+      </w:r>
+      <w:proofErr w:type="spellEnd"/>
+      <w:r>
+        <w:rPr>
+          <w:b/>
+          <w:bCs/>
+          <w:sz w:val="14"/>
+          <w:szCs w:val="14"/>
+        </w:rPr>
+        <w:t>;</w:t>
+      </w:r>
+    </w:p>
+    <w:p>
+      <w:pPr>
         <w:numPr>
           <w:ilvl w:val="0"/>
-          <w:numId w:val="53"/>
+          <w:numId w:val="61"/>
         </w:numPr>
-        <w:spacing w:after="0" w:line="240" w:lineRule="auto"/>
-        <w:rPr>
-          <w:b/>
-          <w:bCs/>
-          <w:sz w:val="14"/>
-          <w:szCs w:val="14"/>
-        </w:rPr>
-      </w:pPr>
-      <w:r>
-        <w:rPr>
-          <w:b/>
-          <w:bCs/>
-          <w:sz w:val="14"/>
-          <w:szCs w:val="14"/>
-        </w:rPr>
-        <w:t>This report Section 10 (Sovereign deployment specifics)</w:t>
+        <w:rPr>
+          <w:b/>
+          <w:bCs/>
+          <w:sz w:val="14"/>
+          <w:szCs w:val="14"/>
+        </w:rPr>
+      </w:pPr>
+      <w:r>
+        <w:rPr>
+          <w:b/>
+          <w:bCs/>
+          <w:sz w:val="14"/>
+          <w:szCs w:val="14"/>
+        </w:rPr>
+        <w:t>backend/</w:t>
+      </w:r>
+      <w:proofErr w:type="spellStart"/>
+      <w:r>
+        <w:rPr>
+          <w:b/>
+          <w:bCs/>
+          <w:sz w:val="14"/>
+          <w:szCs w:val="14"/>
+        </w:rPr>
+        <w:t>src</w:t>
+      </w:r>
+      <w:proofErr w:type="spellEnd"/>
+      <w:r>
+        <w:rPr>
+          <w:b/>
+          <w:bCs/>
+          <w:sz w:val="14"/>
+          <w:szCs w:val="14"/>
+        </w:rPr>
+        <w:t>/</w:t>
+      </w:r>
+      <w:proofErr w:type="spellStart"/>
+      <w:r>
+        <w:rPr>
+          <w:b/>
+          <w:bCs/>
+          <w:sz w:val="14"/>
+          <w:szCs w:val="14"/>
+        </w:rPr>
+        <w:t>db</w:t>
+      </w:r>
+      <w:proofErr w:type="spellEnd"/>
+      <w:r>
+        <w:rPr>
+          <w:b/>
+          <w:bCs/>
+          <w:sz w:val="14"/>
+          <w:szCs w:val="14"/>
+        </w:rPr>
+        <w:t>/migrations/20260XXX_rls_policies.sql — for every customer-data table:</w:t>
       </w:r>
     </w:p>
     <w:p>
       <w:pPr>
-        <w:numPr>
-          <w:ilvl w:val="0"/>
-          <w:numId w:val="53"/>
-        </w:numPr>
-        <w:spacing w:after="0" w:line="240" w:lineRule="auto"/>
-        <w:rPr>
-          <w:b/>
-          <w:bCs/>
-          <w:sz w:val="14"/>
-          <w:szCs w:val="14"/>
-        </w:rPr>
-      </w:pPr>
-      <w:r>
-        <w:rPr>
-          <w:b/>
-          <w:bCs/>
-          <w:sz w:val="14"/>
-          <w:szCs w:val="14"/>
-        </w:rPr>
-        <w:t>This report Section 13 (sovereign tier rules)</w:t>
-      </w:r>
+        <w:rPr>
+          <w:b/>
+          <w:bCs/>
+          <w:sz w:val="14"/>
+          <w:szCs w:val="14"/>
+        </w:rPr>
+      </w:pPr>
+      <w:r>
+        <w:rPr>
+          <w:b/>
+          <w:bCs/>
+          <w:sz w:val="14"/>
+          <w:szCs w:val="14"/>
+        </w:rPr>
+        <w:t xml:space="preserve">ALTER TABLE </w:t>
+      </w:r>
+      <w:proofErr w:type="spellStart"/>
+      <w:r>
+        <w:rPr>
+          <w:b/>
+          <w:bCs/>
+          <w:sz w:val="14"/>
+          <w:szCs w:val="14"/>
+        </w:rPr>
+        <w:t>corpus_documents</w:t>
+      </w:r>
+      <w:proofErr w:type="spellEnd"/>
+      <w:r>
+        <w:rPr>
+          <w:b/>
+          <w:bCs/>
+          <w:sz w:val="14"/>
+          <w:szCs w:val="14"/>
+        </w:rPr>
+        <w:t xml:space="preserve"> ENABLE ROW LEVEL SECURITY;</w:t>
+      </w:r>
+      <w:r>
+        <w:rPr>
+          <w:b/>
+          <w:bCs/>
+          <w:sz w:val="14"/>
+          <w:szCs w:val="14"/>
+        </w:rPr>
+        <w:br/>
+        <w:t xml:space="preserve">CREATE POLICY </w:t>
+      </w:r>
+      <w:proofErr w:type="spellStart"/>
+      <w:r>
+        <w:rPr>
+          <w:b/>
+          <w:bCs/>
+          <w:sz w:val="14"/>
+          <w:szCs w:val="14"/>
+        </w:rPr>
+        <w:t>corpus_documents_user_isolation</w:t>
+      </w:r>
+      <w:proofErr w:type="spellEnd"/>
+      <w:r>
+        <w:rPr>
+          <w:b/>
+          <w:bCs/>
+          <w:sz w:val="14"/>
+          <w:szCs w:val="14"/>
+        </w:rPr>
+        <w:t xml:space="preserve"> ON </w:t>
+      </w:r>
+      <w:proofErr w:type="spellStart"/>
+      <w:r>
+        <w:rPr>
+          <w:b/>
+          <w:bCs/>
+          <w:sz w:val="14"/>
+          <w:szCs w:val="14"/>
+        </w:rPr>
+        <w:t>corpus_documents</w:t>
+      </w:r>
+      <w:proofErr w:type="spellEnd"/>
+      <w:r>
+        <w:rPr>
+          <w:b/>
+          <w:bCs/>
+          <w:sz w:val="14"/>
+          <w:szCs w:val="14"/>
+        </w:rPr>
+        <w:br/>
+        <w:t xml:space="preserve">  FOR ALL TO </w:t>
+      </w:r>
+      <w:proofErr w:type="spellStart"/>
+      <w:r>
+        <w:rPr>
+          <w:b/>
+          <w:bCs/>
+          <w:sz w:val="14"/>
+          <w:szCs w:val="14"/>
+        </w:rPr>
+        <w:t>application_role</w:t>
+      </w:r>
+      <w:proofErr w:type="spellEnd"/>
+      <w:r>
+        <w:rPr>
+          <w:b/>
+          <w:bCs/>
+          <w:sz w:val="14"/>
+          <w:szCs w:val="14"/>
+        </w:rPr>
+        <w:br/>
+        <w:t xml:space="preserve">  USING (</w:t>
+      </w:r>
+      <w:r>
+        <w:rPr>
+          <w:b/>
+          <w:bCs/>
+          <w:sz w:val="14"/>
+          <w:szCs w:val="14"/>
+        </w:rPr>
+        <w:br/>
+        <w:t xml:space="preserve">    </w:t>
+      </w:r>
+      <w:proofErr w:type="spellStart"/>
+      <w:r>
+        <w:rPr>
+          <w:b/>
+          <w:bCs/>
+          <w:sz w:val="14"/>
+          <w:szCs w:val="14"/>
+        </w:rPr>
+        <w:t>user_id</w:t>
+      </w:r>
+      <w:proofErr w:type="spellEnd"/>
+      <w:r>
+        <w:rPr>
+          <w:b/>
+          <w:bCs/>
+          <w:sz w:val="14"/>
+          <w:szCs w:val="14"/>
+        </w:rPr>
+        <w:t xml:space="preserve"> = </w:t>
+      </w:r>
+      <w:proofErr w:type="spellStart"/>
+      <w:r>
+        <w:rPr>
+          <w:b/>
+          <w:bCs/>
+          <w:sz w:val="14"/>
+          <w:szCs w:val="14"/>
+        </w:rPr>
+        <w:t>current_setting</w:t>
+      </w:r>
+      <w:proofErr w:type="spellEnd"/>
+      <w:r>
+        <w:rPr>
+          <w:b/>
+          <w:bCs/>
+          <w:sz w:val="14"/>
+          <w:szCs w:val="14"/>
+        </w:rPr>
+        <w:t>('</w:t>
+      </w:r>
+      <w:proofErr w:type="spellStart"/>
+      <w:r>
+        <w:rPr>
+          <w:b/>
+          <w:bCs/>
+          <w:sz w:val="14"/>
+          <w:szCs w:val="14"/>
+        </w:rPr>
+        <w:t>app.user_id</w:t>
+      </w:r>
+      <w:proofErr w:type="spellEnd"/>
+      <w:r>
+        <w:rPr>
+          <w:b/>
+          <w:bCs/>
+          <w:sz w:val="14"/>
+          <w:szCs w:val="14"/>
+        </w:rPr>
+        <w:t>', true)</w:t>
+      </w:r>
+      <w:r>
+        <w:rPr>
+          <w:b/>
+          <w:bCs/>
+          <w:sz w:val="14"/>
+          <w:szCs w:val="14"/>
+        </w:rPr>
+        <w:br/>
+        <w:t xml:space="preserve">    OR (</w:t>
+      </w:r>
+      <w:proofErr w:type="spellStart"/>
+      <w:r>
+        <w:rPr>
+          <w:b/>
+          <w:bCs/>
+          <w:sz w:val="14"/>
+          <w:szCs w:val="14"/>
+        </w:rPr>
+        <w:t>org_id</w:t>
+      </w:r>
+      <w:proofErr w:type="spellEnd"/>
+      <w:r>
+        <w:rPr>
+          <w:b/>
+          <w:bCs/>
+          <w:sz w:val="14"/>
+          <w:szCs w:val="14"/>
+        </w:rPr>
+        <w:t xml:space="preserve"> IS NOT NULL AND </w:t>
+      </w:r>
+      <w:proofErr w:type="spellStart"/>
+      <w:r>
+        <w:rPr>
+          <w:b/>
+          <w:bCs/>
+          <w:sz w:val="14"/>
+          <w:szCs w:val="14"/>
+        </w:rPr>
+        <w:t>org_id</w:t>
+      </w:r>
+      <w:proofErr w:type="spellEnd"/>
+      <w:r>
+        <w:rPr>
+          <w:b/>
+          <w:bCs/>
+          <w:sz w:val="14"/>
+          <w:szCs w:val="14"/>
+        </w:rPr>
+        <w:t xml:space="preserve"> = </w:t>
+      </w:r>
+      <w:proofErr w:type="spellStart"/>
+      <w:r>
+        <w:rPr>
+          <w:b/>
+          <w:bCs/>
+          <w:sz w:val="14"/>
+          <w:szCs w:val="14"/>
+        </w:rPr>
+        <w:t>current_setting</w:t>
+      </w:r>
+      <w:proofErr w:type="spellEnd"/>
+      <w:r>
+        <w:rPr>
+          <w:b/>
+          <w:bCs/>
+          <w:sz w:val="14"/>
+          <w:szCs w:val="14"/>
+        </w:rPr>
+        <w:t>('</w:t>
+      </w:r>
+      <w:proofErr w:type="spellStart"/>
+      <w:r>
+        <w:rPr>
+          <w:b/>
+          <w:bCs/>
+          <w:sz w:val="14"/>
+          <w:szCs w:val="14"/>
+        </w:rPr>
+        <w:t>app.org_id</w:t>
+      </w:r>
+      <w:proofErr w:type="spellEnd"/>
+      <w:r>
+        <w:rPr>
+          <w:b/>
+          <w:bCs/>
+          <w:sz w:val="14"/>
+          <w:szCs w:val="14"/>
+        </w:rPr>
+        <w:t>', true))</w:t>
+      </w:r>
+      <w:r>
+        <w:rPr>
+          <w:b/>
+          <w:bCs/>
+          <w:sz w:val="14"/>
+          <w:szCs w:val="14"/>
+        </w:rPr>
+        <w:br/>
+        <w:t xml:space="preserve">  );</w:t>
+      </w:r>
+      <w:r>
+        <w:rPr>
+          <w:b/>
+          <w:bCs/>
+          <w:sz w:val="14"/>
+          <w:szCs w:val="14"/>
+        </w:rPr>
+        <w:br/>
+      </w:r>
+      <w:r>
+        <w:rPr>
+          <w:b/>
+          <w:bCs/>
+          <w:i/>
+          <w:sz w:val="14"/>
+          <w:szCs w:val="14"/>
+        </w:rPr>
+        <w:t xml:space="preserve">-- Repeat for: </w:t>
+      </w:r>
+      <w:proofErr w:type="spellStart"/>
+      <w:r>
+        <w:rPr>
+          <w:b/>
+          <w:bCs/>
+          <w:i/>
+          <w:sz w:val="14"/>
+          <w:szCs w:val="14"/>
+        </w:rPr>
+        <w:t>corpus_chunks</w:t>
+      </w:r>
+      <w:proofErr w:type="spellEnd"/>
+      <w:r>
+        <w:rPr>
+          <w:b/>
+          <w:bCs/>
+          <w:i/>
+          <w:sz w:val="14"/>
+          <w:szCs w:val="14"/>
+        </w:rPr>
+        <w:t xml:space="preserve">, claims, contradictions, </w:t>
+      </w:r>
+      <w:proofErr w:type="spellStart"/>
+      <w:r>
+        <w:rPr>
+          <w:b/>
+          <w:bCs/>
+          <w:i/>
+          <w:sz w:val="14"/>
+          <w:szCs w:val="14"/>
+        </w:rPr>
+        <w:t>kg_entities</w:t>
+      </w:r>
+      <w:proofErr w:type="spellEnd"/>
+      <w:r>
+        <w:rPr>
+          <w:b/>
+          <w:bCs/>
+          <w:i/>
+          <w:sz w:val="14"/>
+          <w:szCs w:val="14"/>
+        </w:rPr>
+        <w:t xml:space="preserve">, </w:t>
+      </w:r>
+      <w:proofErr w:type="spellStart"/>
+      <w:r>
+        <w:rPr>
+          <w:b/>
+          <w:bCs/>
+          <w:i/>
+          <w:sz w:val="14"/>
+          <w:szCs w:val="14"/>
+        </w:rPr>
+        <w:t>kg_edges</w:t>
+      </w:r>
+      <w:proofErr w:type="spellEnd"/>
+      <w:r>
+        <w:rPr>
+          <w:b/>
+          <w:bCs/>
+          <w:i/>
+          <w:sz w:val="14"/>
+          <w:szCs w:val="14"/>
+        </w:rPr>
+        <w:t>,</w:t>
+      </w:r>
+      <w:r>
+        <w:rPr>
+          <w:b/>
+          <w:bCs/>
+          <w:sz w:val="14"/>
+          <w:szCs w:val="14"/>
+        </w:rPr>
+        <w:br/>
+      </w:r>
+      <w:r>
+        <w:rPr>
+          <w:b/>
+          <w:bCs/>
+          <w:i/>
+          <w:sz w:val="14"/>
+          <w:szCs w:val="14"/>
+        </w:rPr>
+        <w:t xml:space="preserve">-- reports, </w:t>
+      </w:r>
+      <w:proofErr w:type="spellStart"/>
+      <w:r>
+        <w:rPr>
+          <w:b/>
+          <w:bCs/>
+          <w:i/>
+          <w:sz w:val="14"/>
+          <w:szCs w:val="14"/>
+        </w:rPr>
+        <w:t>report_revisions</w:t>
+      </w:r>
+      <w:proofErr w:type="spellEnd"/>
+      <w:r>
+        <w:rPr>
+          <w:b/>
+          <w:bCs/>
+          <w:i/>
+          <w:sz w:val="14"/>
+          <w:szCs w:val="14"/>
+        </w:rPr>
+        <w:t xml:space="preserve">, </w:t>
+      </w:r>
+      <w:proofErr w:type="spellStart"/>
+      <w:r>
+        <w:rPr>
+          <w:b/>
+          <w:bCs/>
+          <w:i/>
+          <w:sz w:val="14"/>
+          <w:szCs w:val="14"/>
+        </w:rPr>
+        <w:t>research_runs</w:t>
+      </w:r>
+      <w:proofErr w:type="spellEnd"/>
+      <w:r>
+        <w:rPr>
+          <w:b/>
+          <w:bCs/>
+          <w:i/>
+          <w:sz w:val="14"/>
+          <w:szCs w:val="14"/>
+        </w:rPr>
+        <w:t xml:space="preserve">, </w:t>
+      </w:r>
+      <w:proofErr w:type="spellStart"/>
+      <w:r>
+        <w:rPr>
+          <w:b/>
+          <w:bCs/>
+          <w:i/>
+          <w:sz w:val="14"/>
+          <w:szCs w:val="14"/>
+        </w:rPr>
+        <w:t>user_wallets</w:t>
+      </w:r>
+      <w:proofErr w:type="spellEnd"/>
+      <w:r>
+        <w:rPr>
+          <w:b/>
+          <w:bCs/>
+          <w:i/>
+          <w:sz w:val="14"/>
+          <w:szCs w:val="14"/>
+        </w:rPr>
+        <w:t xml:space="preserve">, </w:t>
+      </w:r>
+      <w:proofErr w:type="spellStart"/>
+      <w:r>
+        <w:rPr>
+          <w:b/>
+          <w:bCs/>
+          <w:i/>
+          <w:sz w:val="14"/>
+          <w:szCs w:val="14"/>
+        </w:rPr>
+        <w:t>wallet_ledger</w:t>
+      </w:r>
+      <w:proofErr w:type="spellEnd"/>
+      <w:r>
+        <w:rPr>
+          <w:b/>
+          <w:bCs/>
+          <w:i/>
+          <w:sz w:val="14"/>
+          <w:szCs w:val="14"/>
+        </w:rPr>
+        <w:t>,</w:t>
+      </w:r>
+      <w:r>
+        <w:rPr>
+          <w:b/>
+          <w:bCs/>
+          <w:sz w:val="14"/>
+          <w:szCs w:val="14"/>
+        </w:rPr>
+        <w:br/>
+      </w:r>
+      <w:r>
+        <w:rPr>
+          <w:b/>
+          <w:bCs/>
+          <w:i/>
+          <w:sz w:val="14"/>
+          <w:szCs w:val="14"/>
+        </w:rPr>
+        <w:t xml:space="preserve">-- </w:t>
+      </w:r>
+      <w:proofErr w:type="spellStart"/>
+      <w:r>
+        <w:rPr>
+          <w:b/>
+          <w:bCs/>
+          <w:i/>
+          <w:sz w:val="14"/>
+          <w:szCs w:val="14"/>
+        </w:rPr>
+        <w:t>user_subscriptions</w:t>
+      </w:r>
+      <w:proofErr w:type="spellEnd"/>
+      <w:r>
+        <w:rPr>
+          <w:b/>
+          <w:bCs/>
+          <w:i/>
+          <w:sz w:val="14"/>
+          <w:szCs w:val="14"/>
+        </w:rPr>
+        <w:t xml:space="preserve">, </w:t>
+      </w:r>
+      <w:proofErr w:type="spellStart"/>
+      <w:r>
+        <w:rPr>
+          <w:b/>
+          <w:bCs/>
+          <w:i/>
+          <w:sz w:val="14"/>
+          <w:szCs w:val="14"/>
+        </w:rPr>
+        <w:t>user_tiers</w:t>
+      </w:r>
+      <w:proofErr w:type="spellEnd"/>
+      <w:r>
+        <w:rPr>
+          <w:b/>
+          <w:bCs/>
+          <w:i/>
+          <w:sz w:val="14"/>
+          <w:szCs w:val="14"/>
+        </w:rPr>
+        <w:t xml:space="preserve">, </w:t>
+      </w:r>
+      <w:proofErr w:type="spellStart"/>
+      <w:r>
+        <w:rPr>
+          <w:b/>
+          <w:bCs/>
+          <w:i/>
+          <w:sz w:val="14"/>
+          <w:szCs w:val="14"/>
+        </w:rPr>
+        <w:t>byok_keys</w:t>
+      </w:r>
+      <w:proofErr w:type="spellEnd"/>
+      <w:r>
+        <w:rPr>
+          <w:b/>
+          <w:bCs/>
+          <w:i/>
+          <w:sz w:val="14"/>
+          <w:szCs w:val="14"/>
+        </w:rPr>
+        <w:t xml:space="preserve">, </w:t>
+      </w:r>
+      <w:proofErr w:type="spellStart"/>
+      <w:r>
+        <w:rPr>
+          <w:b/>
+          <w:bCs/>
+          <w:i/>
+          <w:sz w:val="14"/>
+          <w:szCs w:val="14"/>
+        </w:rPr>
+        <w:t>user_ingestion_consent</w:t>
+      </w:r>
+      <w:proofErr w:type="spellEnd"/>
+      <w:r>
+        <w:rPr>
+          <w:b/>
+          <w:bCs/>
+          <w:i/>
+          <w:sz w:val="14"/>
+          <w:szCs w:val="14"/>
+        </w:rPr>
+        <w:t>,</w:t>
+      </w:r>
+      <w:r>
+        <w:rPr>
+          <w:b/>
+          <w:bCs/>
+          <w:sz w:val="14"/>
+          <w:szCs w:val="14"/>
+        </w:rPr>
+        <w:br/>
+      </w:r>
+      <w:r>
+        <w:rPr>
+          <w:b/>
+          <w:bCs/>
+          <w:i/>
+          <w:sz w:val="14"/>
+          <w:szCs w:val="14"/>
+        </w:rPr>
+        <w:t xml:space="preserve">-- </w:t>
+      </w:r>
+      <w:proofErr w:type="spellStart"/>
+      <w:r>
+        <w:rPr>
+          <w:b/>
+          <w:bCs/>
+          <w:i/>
+          <w:sz w:val="14"/>
+          <w:szCs w:val="14"/>
+        </w:rPr>
+        <w:t>run_ingestion_state</w:t>
+      </w:r>
+      <w:proofErr w:type="spellEnd"/>
+      <w:r>
+        <w:rPr>
+          <w:b/>
+          <w:bCs/>
+          <w:i/>
+          <w:sz w:val="14"/>
+          <w:szCs w:val="14"/>
+        </w:rPr>
+        <w:t xml:space="preserve">, </w:t>
+      </w:r>
+      <w:proofErr w:type="spellStart"/>
+      <w:r>
+        <w:rPr>
+          <w:b/>
+          <w:bCs/>
+          <w:i/>
+          <w:sz w:val="14"/>
+          <w:szCs w:val="14"/>
+        </w:rPr>
+        <w:t>run_user_overrides</w:t>
+      </w:r>
+      <w:proofErr w:type="spellEnd"/>
     </w:p>
     <w:p>
       <w:pPr>
-        <w:spacing w:after="0" w:line="240" w:lineRule="auto"/>
-        <w:rPr>
-          <w:b/>
-          <w:bCs/>
-          <w:sz w:val="14"/>
-          <w:szCs w:val="14"/>
-        </w:rPr>
-      </w:pPr>
-      <w:r>
-        <w:rPr>
-          <w:b/>
-          <w:bCs/>
-          <w:sz w:val="14"/>
-          <w:szCs w:val="14"/>
-        </w:rPr>
-        <w:t>Files to create:</w:t>
+        <w:rPr>
+          <w:b/>
+          <w:bCs/>
+          <w:sz w:val="14"/>
+          <w:szCs w:val="14"/>
+        </w:rPr>
+      </w:pPr>
+      <w:r>
+        <w:rPr>
+          <w:b/>
+          <w:bCs/>
+          <w:sz w:val="14"/>
+          <w:szCs w:val="14"/>
+        </w:rPr>
+        <w:t xml:space="preserve">Files to </w:t>
+      </w:r>
+      <w:proofErr w:type="gramStart"/>
+      <w:r>
+        <w:rPr>
+          <w:b/>
+          <w:bCs/>
+          <w:sz w:val="14"/>
+          <w:szCs w:val="14"/>
+        </w:rPr>
+        <w:t>modify:</w:t>
+      </w:r>
+      <w:proofErr w:type="gramEnd"/>
+      <w:r>
+        <w:rPr>
+          <w:b/>
+          <w:bCs/>
+          <w:sz w:val="14"/>
+          <w:szCs w:val="14"/>
+        </w:rPr>
+        <w:t xml:space="preserve"> backend/</w:t>
+      </w:r>
+      <w:proofErr w:type="spellStart"/>
+      <w:r>
+        <w:rPr>
+          <w:b/>
+          <w:bCs/>
+          <w:sz w:val="14"/>
+          <w:szCs w:val="14"/>
+        </w:rPr>
+        <w:t>src</w:t>
+      </w:r>
+      <w:proofErr w:type="spellEnd"/>
+      <w:r>
+        <w:rPr>
+          <w:b/>
+          <w:bCs/>
+          <w:sz w:val="14"/>
+          <w:szCs w:val="14"/>
+        </w:rPr>
+        <w:t>/</w:t>
+      </w:r>
+      <w:proofErr w:type="spellStart"/>
+      <w:r>
+        <w:rPr>
+          <w:b/>
+          <w:bCs/>
+          <w:sz w:val="14"/>
+          <w:szCs w:val="14"/>
+        </w:rPr>
+        <w:t>db</w:t>
+      </w:r>
+      <w:proofErr w:type="spellEnd"/>
+      <w:r>
+        <w:rPr>
+          <w:b/>
+          <w:bCs/>
+          <w:sz w:val="14"/>
+          <w:szCs w:val="14"/>
+        </w:rPr>
+        <w:t>/</w:t>
+      </w:r>
+      <w:proofErr w:type="spellStart"/>
+      <w:r>
+        <w:rPr>
+          <w:b/>
+          <w:bCs/>
+          <w:sz w:val="14"/>
+          <w:szCs w:val="14"/>
+        </w:rPr>
+        <w:t>index.ts</w:t>
+      </w:r>
+      <w:proofErr w:type="spellEnd"/>
+      <w:r>
+        <w:rPr>
+          <w:b/>
+          <w:bCs/>
+          <w:sz w:val="14"/>
+          <w:szCs w:val="14"/>
+        </w:rPr>
+        <w:t xml:space="preserve"> — connect as </w:t>
+      </w:r>
+      <w:proofErr w:type="spellStart"/>
+      <w:r>
+        <w:rPr>
+          <w:b/>
+          <w:bCs/>
+          <w:sz w:val="14"/>
+          <w:szCs w:val="14"/>
+        </w:rPr>
+        <w:t>application_role</w:t>
+      </w:r>
+      <w:proofErr w:type="spellEnd"/>
+      <w:r>
+        <w:rPr>
+          <w:b/>
+          <w:bCs/>
+          <w:sz w:val="14"/>
+          <w:szCs w:val="14"/>
+        </w:rPr>
+        <w:t>, not superuser. Separate connection pool for migration/admin.</w:t>
       </w:r>
     </w:p>
     <w:p>
       <w:pPr>
-        <w:numPr>
-          <w:ilvl w:val="0"/>
-          <w:numId w:val="54"/>
-        </w:numPr>
-        <w:spacing w:after="0" w:line="240" w:lineRule="auto"/>
-        <w:rPr>
-          <w:b/>
-          <w:bCs/>
-          <w:sz w:val="14"/>
-          <w:szCs w:val="14"/>
-        </w:rPr>
-      </w:pPr>
-      <w:r>
-        <w:rPr>
-          <w:b/>
-          <w:bCs/>
-          <w:sz w:val="14"/>
-          <w:szCs w:val="14"/>
-        </w:rPr>
-        <w:t>backend/src/config/deployment.ts:</w:t>
+        <w:rPr>
+          <w:b/>
+          <w:bCs/>
+          <w:sz w:val="14"/>
+          <w:szCs w:val="14"/>
+        </w:rPr>
+      </w:pPr>
+      <w:r>
+        <w:rPr>
+          <w:b/>
+          <w:bCs/>
+          <w:sz w:val="14"/>
+          <w:szCs w:val="14"/>
+        </w:rPr>
+        <w:t xml:space="preserve">Critical: Per .cursor/rules/13-deploy-skew-and-schema.mdc, code must tolerate migrations not applied yet. Stage rollout: 1. Apply migration creating role and grants, but NOT enabling RLS yet 2. Deploy code that connects as </w:t>
+      </w:r>
+      <w:proofErr w:type="spellStart"/>
+      <w:r>
+        <w:rPr>
+          <w:b/>
+          <w:bCs/>
+          <w:sz w:val="14"/>
+          <w:szCs w:val="14"/>
+        </w:rPr>
+        <w:t>application_role</w:t>
+      </w:r>
+      <w:proofErr w:type="spellEnd"/>
+      <w:r>
+        <w:rPr>
+          <w:b/>
+          <w:bCs/>
+          <w:sz w:val="14"/>
+          <w:szCs w:val="14"/>
+        </w:rPr>
+        <w:t xml:space="preserve"> 3. Apply migration enabling RLS and creating policies 4. Verify in production with read-only checks before promoting</w:t>
       </w:r>
     </w:p>
     <w:p>
       <w:pPr>
-        <w:spacing w:after="0" w:line="240" w:lineRule="auto"/>
-        <w:rPr>
-          <w:b/>
-          <w:bCs/>
-          <w:sz w:val="14"/>
-          <w:szCs w:val="14"/>
-        </w:rPr>
-      </w:pPr>
-      <w:r>
-        <w:rPr>
-          <w:b/>
-          <w:bCs/>
-          <w:sz w:val="14"/>
-          <w:szCs w:val="14"/>
-        </w:rPr>
-        <w:t>typescript</w:t>
+        <w:rPr>
+          <w:b/>
+          <w:bCs/>
+          <w:sz w:val="14"/>
+          <w:szCs w:val="14"/>
+        </w:rPr>
+      </w:pPr>
+      <w:r>
+        <w:rPr>
+          <w:b/>
+          <w:bCs/>
+          <w:sz w:val="14"/>
+          <w:szCs w:val="14"/>
+        </w:rPr>
+        <w:t xml:space="preserve">Acceptance criteria: - Two seeded users in DB. Set </w:t>
+      </w:r>
+      <w:proofErr w:type="spellStart"/>
+      <w:r>
+        <w:rPr>
+          <w:b/>
+          <w:bCs/>
+          <w:sz w:val="14"/>
+          <w:szCs w:val="14"/>
+        </w:rPr>
+        <w:t>app.user_id</w:t>
+      </w:r>
+      <w:proofErr w:type="spellEnd"/>
+      <w:r>
+        <w:rPr>
+          <w:b/>
+          <w:bCs/>
+          <w:sz w:val="14"/>
+          <w:szCs w:val="14"/>
+        </w:rPr>
+        <w:t xml:space="preserve"> = </w:t>
+      </w:r>
+      <w:proofErr w:type="spellStart"/>
+      <w:r>
+        <w:rPr>
+          <w:b/>
+          <w:bCs/>
+          <w:sz w:val="14"/>
+          <w:szCs w:val="14"/>
+        </w:rPr>
+        <w:t>user_a</w:t>
+      </w:r>
+      <w:proofErr w:type="spellEnd"/>
+      <w:r>
+        <w:rPr>
+          <w:b/>
+          <w:bCs/>
+          <w:sz w:val="14"/>
+          <w:szCs w:val="14"/>
+        </w:rPr>
+        <w:t xml:space="preserve">. Query </w:t>
+      </w:r>
+      <w:proofErr w:type="spellStart"/>
+      <w:r>
+        <w:rPr>
+          <w:b/>
+          <w:bCs/>
+          <w:sz w:val="14"/>
+          <w:szCs w:val="14"/>
+        </w:rPr>
+        <w:t>corpus_documents</w:t>
+      </w:r>
+      <w:proofErr w:type="spellEnd"/>
+      <w:r>
+        <w:rPr>
+          <w:b/>
+          <w:bCs/>
+          <w:sz w:val="14"/>
+          <w:szCs w:val="14"/>
+        </w:rPr>
+        <w:t xml:space="preserve"> </w:t>
+      </w:r>
+      <w:proofErr w:type="gramStart"/>
+      <w:r>
+        <w:rPr>
+          <w:b/>
+          <w:bCs/>
+          <w:sz w:val="14"/>
+          <w:szCs w:val="14"/>
+        </w:rPr>
+        <w:t>returns</w:t>
+      </w:r>
+      <w:proofErr w:type="gramEnd"/>
+      <w:r>
+        <w:rPr>
+          <w:b/>
+          <w:bCs/>
+          <w:sz w:val="14"/>
+          <w:szCs w:val="14"/>
+        </w:rPr>
+        <w:t xml:space="preserve"> only user A’s docs. Set to </w:t>
+      </w:r>
+      <w:proofErr w:type="spellStart"/>
+      <w:r>
+        <w:rPr>
+          <w:b/>
+          <w:bCs/>
+          <w:sz w:val="14"/>
+          <w:szCs w:val="14"/>
+        </w:rPr>
+        <w:t>user_b</w:t>
+      </w:r>
+      <w:proofErr w:type="spellEnd"/>
+      <w:r>
+        <w:rPr>
+          <w:b/>
+          <w:bCs/>
+          <w:sz w:val="14"/>
+          <w:szCs w:val="14"/>
+        </w:rPr>
+        <w:t xml:space="preserve">. Returns only user </w:t>
+      </w:r>
+      <w:proofErr w:type="gramStart"/>
+      <w:r>
+        <w:rPr>
+          <w:b/>
+          <w:bCs/>
+          <w:sz w:val="14"/>
+          <w:szCs w:val="14"/>
+        </w:rPr>
+        <w:t>B’s</w:t>
+      </w:r>
+      <w:proofErr w:type="gramEnd"/>
+      <w:r>
+        <w:rPr>
+          <w:b/>
+          <w:bCs/>
+          <w:sz w:val="14"/>
+          <w:szCs w:val="14"/>
+        </w:rPr>
+        <w:t>. No session var → returns zero rows. - Team org members can read each other’s reports within org but not outside it - Sovereign tier doesn’t use this DB at all (lives on dedicated DB)</w:t>
       </w:r>
     </w:p>
     <w:p>
       <w:pPr>
-        <w:spacing w:after="0" w:line="240" w:lineRule="auto"/>
-        <w:rPr>
-          <w:b/>
-          <w:bCs/>
-          <w:sz w:val="14"/>
-          <w:szCs w:val="14"/>
-        </w:rPr>
-      </w:pPr>
-      <w:r>
-        <w:rPr>
-          <w:b/>
-          <w:bCs/>
-          <w:sz w:val="14"/>
-          <w:szCs w:val="14"/>
-        </w:rPr>
-        <w:t>export const DEPLOYMENT_MODE = process.env.DEPLOYMENT_MODE ?? 'b2c_shared';</w:t>
+        <w:rPr>
+          <w:b/>
+          <w:bCs/>
+          <w:sz w:val="14"/>
+          <w:szCs w:val="14"/>
+        </w:rPr>
+      </w:pPr>
+      <w:r>
+        <w:rPr>
+          <w:b/>
+          <w:bCs/>
+          <w:sz w:val="14"/>
+          <w:szCs w:val="14"/>
+        </w:rPr>
+        <w:t xml:space="preserve">Tests required (must fail without the fix): </w:t>
+      </w:r>
+      <w:proofErr w:type="spellStart"/>
+      <w:proofErr w:type="gramStart"/>
+      <w:r>
+        <w:rPr>
+          <w:b/>
+          <w:bCs/>
+          <w:sz w:val="14"/>
+          <w:szCs w:val="14"/>
+        </w:rPr>
+        <w:t>rls.cross</w:t>
+      </w:r>
+      <w:proofErr w:type="gramEnd"/>
+      <w:r>
+        <w:rPr>
+          <w:b/>
+          <w:bCs/>
+          <w:sz w:val="14"/>
+          <w:szCs w:val="14"/>
+        </w:rPr>
+        <w:t>-user.test.ts</w:t>
+      </w:r>
+      <w:proofErr w:type="spellEnd"/>
+      <w:r>
+        <w:rPr>
+          <w:b/>
+          <w:bCs/>
+          <w:sz w:val="14"/>
+          <w:szCs w:val="14"/>
+        </w:rPr>
+        <w:t xml:space="preserve"> (seed two users, verify isolation), rls.no-</w:t>
+      </w:r>
+      <w:proofErr w:type="spellStart"/>
+      <w:r>
+        <w:rPr>
+          <w:b/>
+          <w:bCs/>
+          <w:sz w:val="14"/>
+          <w:szCs w:val="14"/>
+        </w:rPr>
+        <w:t>context.test.ts</w:t>
+      </w:r>
+      <w:proofErr w:type="spellEnd"/>
+      <w:r>
+        <w:rPr>
+          <w:b/>
+          <w:bCs/>
+          <w:sz w:val="14"/>
+          <w:szCs w:val="14"/>
+        </w:rPr>
+        <w:t xml:space="preserve"> (clear session var, verify zero rows), </w:t>
+      </w:r>
+      <w:proofErr w:type="spellStart"/>
+      <w:r>
+        <w:rPr>
+          <w:b/>
+          <w:bCs/>
+          <w:sz w:val="14"/>
+          <w:szCs w:val="14"/>
+        </w:rPr>
+        <w:t>rls.org.test.ts</w:t>
+      </w:r>
+      <w:proofErr w:type="spellEnd"/>
+      <w:r>
+        <w:rPr>
+          <w:b/>
+          <w:bCs/>
+          <w:sz w:val="14"/>
+          <w:szCs w:val="14"/>
+        </w:rPr>
+        <w:t xml:space="preserve"> (seed org with two members, verify shared access).</w:t>
       </w:r>
     </w:p>
-    <w:p>
-      <w:pPr>
-        <w:spacing w:after="0" w:line="240" w:lineRule="auto"/>
-        <w:rPr>
-          <w:b/>
-          <w:bCs/>
-          <w:sz w:val="14"/>
-          <w:szCs w:val="14"/>
-        </w:rPr>
-      </w:pPr>
-      <w:r>
-        <w:rPr>
-          <w:b/>
-          <w:bCs/>
-          <w:sz w:val="14"/>
-          <w:szCs w:val="14"/>
-        </w:rPr>
-        <w:t>// 'b2c_shared' | 'sovereign'</w:t>
-      </w:r>
-    </w:p>
-    <w:p>
-      <w:pPr>
-        <w:spacing w:after="0" w:line="240" w:lineRule="auto"/>
-        <w:rPr>
-          <w:b/>
-          <w:bCs/>
-          <w:sz w:val="14"/>
-          <w:szCs w:val="14"/>
-        </w:rPr>
-      </w:pPr>
-    </w:p>
-    <w:p>
-      <w:pPr>
-        <w:spacing w:after="0" w:line="240" w:lineRule="auto"/>
-        <w:rPr>
-          <w:b/>
-          <w:bCs/>
-          <w:sz w:val="14"/>
-          <w:szCs w:val="14"/>
-        </w:rPr>
-      </w:pPr>
-      <w:r>
-        <w:rPr>
-          <w:b/>
-          <w:bCs/>
-          <w:sz w:val="14"/>
-          <w:szCs w:val="14"/>
-        </w:rPr>
-        <w:t>export const EXCLUDE_INTELLME_CLIENT =</w:t>
-      </w:r>
-    </w:p>
-    <w:p>
-      <w:pPr>
-        <w:spacing w:after="0" w:line="240" w:lineRule="auto"/>
-        <w:rPr>
-          <w:b/>
-          <w:bCs/>
-          <w:sz w:val="14"/>
-          <w:szCs w:val="14"/>
-        </w:rPr>
-      </w:pPr>
-      <w:r>
-        <w:rPr>
-          <w:b/>
-          <w:bCs/>
-          <w:sz w:val="14"/>
-          <w:szCs w:val="14"/>
-        </w:rPr>
-        <w:t xml:space="preserve">  process.env.EXCLUDE_INTELLME_CLIENT === 'true' ||</w:t>
-      </w:r>
-    </w:p>
-    <w:p>
-      <w:pPr>
-        <w:spacing w:after="0" w:line="240" w:lineRule="auto"/>
-        <w:rPr>
-          <w:b/>
-          <w:bCs/>
-          <w:sz w:val="14"/>
-          <w:szCs w:val="14"/>
-        </w:rPr>
-      </w:pPr>
-      <w:r>
-        <w:rPr>
-          <w:b/>
-          <w:bCs/>
-          <w:sz w:val="14"/>
-          <w:szCs w:val="14"/>
-        </w:rPr>
-        <w:t xml:space="preserve">  DEPLOYMENT_MODE === 'sovereign';</w:t>
-      </w:r>
-    </w:p>
-    <w:p>
-      <w:pPr>
-        <w:numPr>
-          <w:ilvl w:val="0"/>
-          <w:numId w:val="55"/>
-        </w:numPr>
-        <w:spacing w:after="0" w:line="240" w:lineRule="auto"/>
-        <w:rPr>
-          <w:b/>
-          <w:bCs/>
-          <w:sz w:val="14"/>
-          <w:szCs w:val="14"/>
-        </w:rPr>
-      </w:pPr>
-      <w:r>
-        <w:rPr>
-          <w:b/>
-          <w:bCs/>
-          <w:sz w:val="14"/>
-          <w:szCs w:val="14"/>
-        </w:rPr>
-        <w:t>backend/src/services/ingestion/intellmeClient.stub.ts:</w:t>
-      </w:r>
-    </w:p>
-    <w:p>
-      <w:pPr>
-        <w:spacing w:after="0" w:line="240" w:lineRule="auto"/>
-        <w:rPr>
-          <w:b/>
-          <w:bCs/>
-          <w:sz w:val="14"/>
-          <w:szCs w:val="14"/>
-        </w:rPr>
-      </w:pPr>
-      <w:r>
-        <w:rPr>
-          <w:b/>
-          <w:bCs/>
-          <w:sz w:val="14"/>
-          <w:szCs w:val="14"/>
-        </w:rPr>
-        <w:t>typescript</w:t>
-      </w:r>
-    </w:p>
-    <w:p>
-      <w:pPr>
-        <w:spacing w:after="0" w:line="240" w:lineRule="auto"/>
-        <w:rPr>
-          <w:b/>
-          <w:bCs/>
-          <w:sz w:val="14"/>
-          <w:szCs w:val="14"/>
-        </w:rPr>
-      </w:pPr>
-      <w:r>
-        <w:rPr>
-          <w:b/>
-          <w:bCs/>
-          <w:sz w:val="14"/>
-          <w:szCs w:val="14"/>
-        </w:rPr>
-        <w:t>// Stub used in Sovereign builds. Throws on any call.</w:t>
-      </w:r>
-    </w:p>
-    <w:p>
-      <w:pPr>
-        <w:spacing w:after="0" w:line="240" w:lineRule="auto"/>
-        <w:rPr>
-          <w:b/>
-          <w:bCs/>
-          <w:sz w:val="14"/>
-          <w:szCs w:val="14"/>
-        </w:rPr>
-      </w:pPr>
-      <w:r>
-        <w:rPr>
-          <w:b/>
-          <w:bCs/>
-          <w:sz w:val="14"/>
-          <w:szCs w:val="14"/>
-        </w:rPr>
-        <w:t>export const intellmeClient = {</w:t>
-      </w:r>
-    </w:p>
-    <w:p>
-      <w:pPr>
-        <w:spacing w:after="0" w:line="240" w:lineRule="auto"/>
-        <w:rPr>
-          <w:b/>
-          <w:bCs/>
-          <w:sz w:val="14"/>
-          <w:szCs w:val="14"/>
-        </w:rPr>
-      </w:pPr>
-      <w:r>
-        <w:rPr>
-          <w:b/>
-          <w:bCs/>
-          <w:sz w:val="14"/>
-          <w:szCs w:val="14"/>
-        </w:rPr>
-        <w:t xml:space="preserve">  ingest: () =&gt; {</w:t>
-      </w:r>
-    </w:p>
-    <w:p>
-      <w:pPr>
-        <w:spacing w:after="0" w:line="240" w:lineRule="auto"/>
-        <w:rPr>
-          <w:b/>
-          <w:bCs/>
-          <w:sz w:val="14"/>
-          <w:szCs w:val="14"/>
-        </w:rPr>
-      </w:pPr>
-      <w:r>
-        <w:rPr>
-          <w:b/>
-          <w:bCs/>
-          <w:sz w:val="14"/>
-          <w:szCs w:val="14"/>
-        </w:rPr>
-        <w:t xml:space="preserve">    throw new Error(</w:t>
-      </w:r>
-    </w:p>
-    <w:p>
-      <w:pPr>
-        <w:spacing w:after="0" w:line="240" w:lineRule="auto"/>
-        <w:rPr>
-          <w:b/>
-          <w:bCs/>
-          <w:sz w:val="14"/>
-          <w:szCs w:val="14"/>
-        </w:rPr>
-      </w:pPr>
-      <w:r>
-        <w:rPr>
-          <w:b/>
-          <w:bCs/>
-          <w:sz w:val="14"/>
-          <w:szCs w:val="14"/>
-        </w:rPr>
-        <w:t xml:space="preserve">      'InTellMe client is disabled in this deployment. ' +</w:t>
-      </w:r>
-    </w:p>
-    <w:p>
-      <w:pPr>
-        <w:spacing w:after="0" w:line="240" w:lineRule="auto"/>
-        <w:rPr>
-          <w:b/>
-          <w:bCs/>
-          <w:sz w:val="14"/>
-          <w:szCs w:val="14"/>
-        </w:rPr>
-      </w:pPr>
-      <w:r>
-        <w:rPr>
-          <w:b/>
-          <w:bCs/>
-          <w:sz w:val="14"/>
-          <w:szCs w:val="14"/>
-        </w:rPr>
-        <w:t xml:space="preserve">      'This call should never have been made.'</w:t>
-      </w:r>
-    </w:p>
-    <w:p>
-      <w:pPr>
-        <w:spacing w:after="0" w:line="240" w:lineRule="auto"/>
-        <w:rPr>
-          <w:b/>
-          <w:bCs/>
-          <w:sz w:val="14"/>
-          <w:szCs w:val="14"/>
-        </w:rPr>
-      </w:pPr>
-      <w:r>
-        <w:rPr>
-          <w:b/>
-          <w:bCs/>
-          <w:sz w:val="14"/>
-          <w:szCs w:val="14"/>
-        </w:rPr>
-        <w:t xml:space="preserve">    );</w:t>
-      </w:r>
-    </w:p>
-    <w:p>
-      <w:pPr>
-        <w:spacing w:after="0" w:line="240" w:lineRule="auto"/>
-        <w:rPr>
-          <w:b/>
-          <w:bCs/>
-          <w:sz w:val="14"/>
-          <w:szCs w:val="14"/>
-        </w:rPr>
-      </w:pPr>
-      <w:r>
-        <w:rPr>
-          <w:b/>
-          <w:bCs/>
-          <w:sz w:val="14"/>
-          <w:szCs w:val="14"/>
-        </w:rPr>
-        <w:t xml:space="preserve">  },</w:t>
-      </w:r>
-    </w:p>
-    <w:p>
-      <w:pPr>
-        <w:spacing w:after="0" w:line="240" w:lineRule="auto"/>
-        <w:rPr>
-          <w:b/>
-          <w:bCs/>
-          <w:sz w:val="14"/>
-          <w:szCs w:val="14"/>
-        </w:rPr>
-      </w:pPr>
-      <w:r>
-        <w:rPr>
-          <w:b/>
-          <w:bCs/>
-          <w:sz w:val="14"/>
-          <w:szCs w:val="14"/>
-        </w:rPr>
-        <w:t xml:space="preserve">  delete: () =&gt; {</w:t>
-      </w:r>
-    </w:p>
-    <w:p>
-      <w:pPr>
-        <w:spacing w:after="0" w:line="240" w:lineRule="auto"/>
-        <w:rPr>
-          <w:b/>
-          <w:bCs/>
-          <w:sz w:val="14"/>
-          <w:szCs w:val="14"/>
-        </w:rPr>
-      </w:pPr>
-      <w:r>
-        <w:rPr>
-          <w:b/>
-          <w:bCs/>
-          <w:sz w:val="14"/>
-          <w:szCs w:val="14"/>
-        </w:rPr>
-        <w:t xml:space="preserve">    throw new Error('InTellMe client is disabled.');</w:t>
-      </w:r>
-    </w:p>
-    <w:p>
-      <w:pPr>
-        <w:spacing w:after="0" w:line="240" w:lineRule="auto"/>
-        <w:rPr>
-          <w:b/>
-          <w:bCs/>
-          <w:sz w:val="14"/>
-          <w:szCs w:val="14"/>
-        </w:rPr>
-      </w:pPr>
-      <w:r>
-        <w:rPr>
-          <w:b/>
-          <w:bCs/>
-          <w:sz w:val="14"/>
-          <w:szCs w:val="14"/>
-        </w:rPr>
-        <w:t xml:space="preserve">  },</w:t>
-      </w:r>
-    </w:p>
-    <w:p>
-      <w:pPr>
-        <w:spacing w:after="0" w:line="240" w:lineRule="auto"/>
-        <w:rPr>
-          <w:b/>
-          <w:bCs/>
-          <w:sz w:val="14"/>
-          <w:szCs w:val="14"/>
-        </w:rPr>
-      </w:pPr>
-      <w:r>
-        <w:rPr>
-          <w:b/>
-          <w:bCs/>
-          <w:sz w:val="14"/>
-          <w:szCs w:val="14"/>
-        </w:rPr>
-        <w:t xml:space="preserve">  query: () =&gt; {</w:t>
-      </w:r>
-    </w:p>
-    <w:p>
-      <w:pPr>
-        <w:spacing w:after="0" w:line="240" w:lineRule="auto"/>
-        <w:rPr>
-          <w:b/>
-          <w:bCs/>
-          <w:sz w:val="14"/>
-          <w:szCs w:val="14"/>
-        </w:rPr>
-      </w:pPr>
-      <w:r>
-        <w:rPr>
-          <w:b/>
-          <w:bCs/>
-          <w:sz w:val="14"/>
-          <w:szCs w:val="14"/>
-        </w:rPr>
-        <w:t xml:space="preserve">    throw new Error('InTellMe client is disabled.');</w:t>
-      </w:r>
-    </w:p>
-    <w:p>
-      <w:pPr>
-        <w:spacing w:after="0" w:line="240" w:lineRule="auto"/>
-        <w:rPr>
-          <w:b/>
-          <w:bCs/>
-          <w:sz w:val="14"/>
-          <w:szCs w:val="14"/>
-        </w:rPr>
-      </w:pPr>
-      <w:r>
-        <w:rPr>
-          <w:b/>
-          <w:bCs/>
-          <w:sz w:val="14"/>
-          <w:szCs w:val="14"/>
-        </w:rPr>
-        <w:t xml:space="preserve">  },</w:t>
-      </w:r>
-    </w:p>
-    <w:p>
-      <w:pPr>
-        <w:spacing w:after="0" w:line="240" w:lineRule="auto"/>
-        <w:rPr>
-          <w:b/>
-          <w:bCs/>
-          <w:sz w:val="14"/>
-          <w:szCs w:val="14"/>
-        </w:rPr>
-      </w:pPr>
-      <w:r>
-        <w:rPr>
-          <w:b/>
-          <w:bCs/>
-          <w:sz w:val="14"/>
-          <w:szCs w:val="14"/>
-        </w:rPr>
-        <w:t>};</w:t>
-      </w:r>
-    </w:p>
-    <w:p>
-      <w:pPr>
-        <w:numPr>
-          <w:ilvl w:val="0"/>
-          <w:numId w:val="56"/>
-        </w:numPr>
-        <w:spacing w:after="0" w:line="240" w:lineRule="auto"/>
-        <w:rPr>
-          <w:b/>
-          <w:bCs/>
-          <w:sz w:val="14"/>
-          <w:szCs w:val="14"/>
-        </w:rPr>
-      </w:pPr>
-      <w:r>
-        <w:rPr>
-          <w:b/>
-          <w:bCs/>
-          <w:sz w:val="14"/>
-          <w:szCs w:val="14"/>
-        </w:rPr>
-        <w:t>backend/src/services/ingestion/intellmeClient.ts — real implementation (in Work Order L)</w:t>
-      </w:r>
-    </w:p>
-    <w:p>
-      <w:pPr>
-        <w:numPr>
-          <w:ilvl w:val="0"/>
-          <w:numId w:val="56"/>
-        </w:numPr>
-        <w:spacing w:after="0" w:line="240" w:lineRule="auto"/>
-        <w:rPr>
-          <w:b/>
-          <w:bCs/>
-          <w:sz w:val="14"/>
-          <w:szCs w:val="14"/>
-        </w:rPr>
-      </w:pPr>
-      <w:r>
-        <w:rPr>
-          <w:b/>
-          <w:bCs/>
-          <w:sz w:val="14"/>
-          <w:szCs w:val="14"/>
-        </w:rPr>
-        <w:t>backend/src/services/ingestion/index.ts:</w:t>
-      </w:r>
-    </w:p>
-    <w:p>
-      <w:pPr>
-        <w:spacing w:after="0" w:line="240" w:lineRule="auto"/>
-        <w:rPr>
-          <w:b/>
-          <w:bCs/>
-          <w:sz w:val="14"/>
-          <w:szCs w:val="14"/>
-        </w:rPr>
-      </w:pPr>
-      <w:r>
-        <w:rPr>
-          <w:b/>
-          <w:bCs/>
-          <w:sz w:val="14"/>
-          <w:szCs w:val="14"/>
-        </w:rPr>
-        <w:t>typescript</w:t>
-      </w:r>
-    </w:p>
-    <w:p>
-      <w:pPr>
-        <w:spacing w:after="0" w:line="240" w:lineRule="auto"/>
-        <w:rPr>
-          <w:b/>
-          <w:bCs/>
-          <w:sz w:val="14"/>
-          <w:szCs w:val="14"/>
-        </w:rPr>
-      </w:pPr>
-      <w:r>
-        <w:rPr>
-          <w:b/>
-          <w:bCs/>
-          <w:sz w:val="14"/>
-          <w:szCs w:val="14"/>
-        </w:rPr>
-        <w:t>import { EXCLUDE_INTELLME_CLIENT } from '../../config/deployment';</w:t>
-      </w:r>
-    </w:p>
-    <w:p>
-      <w:pPr>
-        <w:spacing w:after="0" w:line="240" w:lineRule="auto"/>
-        <w:rPr>
-          <w:b/>
-          <w:bCs/>
-          <w:sz w:val="14"/>
-          <w:szCs w:val="14"/>
-        </w:rPr>
-      </w:pPr>
-      <w:r>
-        <w:rPr>
-          <w:b/>
-          <w:bCs/>
-          <w:sz w:val="14"/>
-          <w:szCs w:val="14"/>
-        </w:rPr>
-        <w:t>export const intellmeClient = EXCLUDE_INTELLME_CLIENT</w:t>
-      </w:r>
-    </w:p>
-    <w:p>
-      <w:pPr>
-        <w:spacing w:after="0" w:line="240" w:lineRule="auto"/>
-        <w:rPr>
-          <w:b/>
-          <w:bCs/>
-          <w:sz w:val="14"/>
-          <w:szCs w:val="14"/>
-        </w:rPr>
-      </w:pPr>
-      <w:r>
-        <w:rPr>
-          <w:b/>
-          <w:bCs/>
-          <w:sz w:val="14"/>
-          <w:szCs w:val="14"/>
-        </w:rPr>
-        <w:t xml:space="preserve">  ? require('./intellmeClient.stub').intellmeClient</w:t>
-      </w:r>
-    </w:p>
-    <w:p>
-      <w:pPr>
-        <w:spacing w:after="0" w:line="240" w:lineRule="auto"/>
-        <w:rPr>
-          <w:b/>
-          <w:bCs/>
-          <w:sz w:val="14"/>
-          <w:szCs w:val="14"/>
-        </w:rPr>
-      </w:pPr>
-      <w:r>
-        <w:rPr>
-          <w:b/>
-          <w:bCs/>
-          <w:sz w:val="14"/>
-          <w:szCs w:val="14"/>
-        </w:rPr>
-        <w:t xml:space="preserve">  : require('./intellmeClient').intellmeClient;</w:t>
-      </w:r>
-    </w:p>
-    <w:p>
-      <w:pPr>
-        <w:numPr>
-          <w:ilvl w:val="0"/>
-          <w:numId w:val="57"/>
-        </w:numPr>
-        <w:spacing w:after="0" w:line="240" w:lineRule="auto"/>
-        <w:rPr>
-          <w:b/>
-          <w:bCs/>
-          <w:sz w:val="14"/>
-          <w:szCs w:val="14"/>
-        </w:rPr>
-      </w:pPr>
-      <w:r>
-        <w:rPr>
-          <w:b/>
-          <w:bCs/>
-          <w:sz w:val="14"/>
-          <w:szCs w:val="14"/>
-        </w:rPr>
-        <w:t xml:space="preserve">infra/sovereign/provision.example.tf — Terraform template (or equivalent IaC) for Sovereign customer provisioning. This is a </w:t>
-      </w:r>
-      <w:r>
-        <w:rPr>
-          <w:b/>
-          <w:bCs/>
-          <w:i/>
-          <w:iCs/>
-          <w:sz w:val="14"/>
-          <w:szCs w:val="14"/>
-        </w:rPr>
-        <w:t>template</w:t>
-      </w:r>
-      <w:r>
-        <w:rPr>
-          <w:b/>
-          <w:bCs/>
-          <w:sz w:val="14"/>
-          <w:szCs w:val="14"/>
-        </w:rPr>
-        <w:t>, not auto-applied. Document the manual provisioning checklist as docs/sovereign/PROVISIONING.md.</w:t>
-      </w:r>
-    </w:p>
-    <w:p>
-      <w:pPr>
-        <w:numPr>
-          <w:ilvl w:val="0"/>
-          <w:numId w:val="57"/>
-        </w:numPr>
-        <w:spacing w:after="0" w:line="240" w:lineRule="auto"/>
-        <w:rPr>
-          <w:b/>
-          <w:bCs/>
-          <w:sz w:val="14"/>
-          <w:szCs w:val="14"/>
-        </w:rPr>
-      </w:pPr>
-      <w:r>
-        <w:rPr>
-          <w:b/>
-          <w:bCs/>
-          <w:sz w:val="14"/>
-          <w:szCs w:val="14"/>
-        </w:rPr>
-        <w:t>infra/sovereign/Dockerfile.sovereign:</w:t>
-      </w:r>
-    </w:p>
-    <w:p>
-      <w:pPr>
-        <w:spacing w:after="0" w:line="240" w:lineRule="auto"/>
-        <w:rPr>
-          <w:b/>
-          <w:bCs/>
-          <w:sz w:val="14"/>
-          <w:szCs w:val="14"/>
-        </w:rPr>
-      </w:pPr>
-      <w:r>
-        <w:rPr>
-          <w:b/>
-          <w:bCs/>
-          <w:sz w:val="14"/>
-          <w:szCs w:val="14"/>
-        </w:rPr>
-        <w:t>dockerfile</w:t>
-      </w:r>
-    </w:p>
-    <w:p>
-      <w:pPr>
-        <w:spacing w:after="0" w:line="240" w:lineRule="auto"/>
-        <w:rPr>
-          <w:b/>
-          <w:bCs/>
-          <w:sz w:val="14"/>
-          <w:szCs w:val="14"/>
-        </w:rPr>
-      </w:pPr>
-      <w:r>
-        <w:rPr>
-          <w:b/>
-          <w:bCs/>
-          <w:sz w:val="14"/>
-          <w:szCs w:val="14"/>
-        </w:rPr>
-        <w:t># Sovereign build excludes InTellMe client at build time</w:t>
-      </w:r>
-    </w:p>
-    <w:p>
-      <w:pPr>
-        <w:spacing w:after="0" w:line="240" w:lineRule="auto"/>
-        <w:rPr>
-          <w:b/>
-          <w:bCs/>
-          <w:sz w:val="14"/>
-          <w:szCs w:val="14"/>
-        </w:rPr>
-      </w:pPr>
-      <w:r>
-        <w:rPr>
-          <w:b/>
-          <w:bCs/>
-          <w:sz w:val="14"/>
-          <w:szCs w:val="14"/>
-        </w:rPr>
-        <w:t>FROM node:22-alpine AS builder</w:t>
-      </w:r>
-    </w:p>
-    <w:p>
-      <w:pPr>
-        <w:spacing w:after="0" w:line="240" w:lineRule="auto"/>
-        <w:rPr>
-          <w:b/>
-          <w:bCs/>
-          <w:sz w:val="14"/>
-          <w:szCs w:val="14"/>
-        </w:rPr>
-      </w:pPr>
-      <w:r>
-        <w:rPr>
-          <w:b/>
-          <w:bCs/>
-          <w:sz w:val="14"/>
-          <w:szCs w:val="14"/>
-        </w:rPr>
-        <w:t>WORKDIR /app</w:t>
-      </w:r>
-    </w:p>
-    <w:p>
-      <w:pPr>
-        <w:spacing w:after="0" w:line="240" w:lineRule="auto"/>
-        <w:rPr>
-          <w:b/>
-          <w:bCs/>
-          <w:sz w:val="14"/>
-          <w:szCs w:val="14"/>
-        </w:rPr>
-      </w:pPr>
-      <w:r>
-        <w:rPr>
-          <w:b/>
-          <w:bCs/>
-          <w:sz w:val="14"/>
-          <w:szCs w:val="14"/>
-        </w:rPr>
-        <w:t>COPY backend/package*.json ./</w:t>
-      </w:r>
-    </w:p>
-    <w:p>
-      <w:pPr>
-        <w:spacing w:after="0" w:line="240" w:lineRule="auto"/>
-        <w:rPr>
-          <w:b/>
-          <w:bCs/>
-          <w:sz w:val="14"/>
-          <w:szCs w:val="14"/>
-        </w:rPr>
-      </w:pPr>
-      <w:r>
-        <w:rPr>
-          <w:b/>
-          <w:bCs/>
-          <w:sz w:val="14"/>
-          <w:szCs w:val="14"/>
-        </w:rPr>
-        <w:t>RUN npm ci --omit=dev</w:t>
-      </w:r>
-    </w:p>
-    <w:p>
-      <w:pPr>
-        <w:spacing w:after="0" w:line="240" w:lineRule="auto"/>
-        <w:rPr>
-          <w:b/>
-          <w:bCs/>
-          <w:sz w:val="14"/>
-          <w:szCs w:val="14"/>
-        </w:rPr>
-      </w:pPr>
-      <w:r>
-        <w:rPr>
-          <w:b/>
-          <w:bCs/>
-          <w:sz w:val="14"/>
-          <w:szCs w:val="14"/>
-        </w:rPr>
-        <w:t>COPY backend/ ./</w:t>
-      </w:r>
-    </w:p>
-    <w:p>
-      <w:pPr>
-        <w:spacing w:after="0" w:line="240" w:lineRule="auto"/>
-        <w:rPr>
-          <w:b/>
-          <w:bCs/>
-          <w:sz w:val="14"/>
-          <w:szCs w:val="14"/>
-        </w:rPr>
-      </w:pPr>
-      <w:r>
-        <w:rPr>
-          <w:b/>
-          <w:bCs/>
-          <w:sz w:val="14"/>
-          <w:szCs w:val="14"/>
-        </w:rPr>
-        <w:t>ENV EXCLUDE_INTELLME_CLIENT=true</w:t>
-      </w:r>
-    </w:p>
-    <w:p>
-      <w:pPr>
-        <w:spacing w:after="0" w:line="240" w:lineRule="auto"/>
-        <w:rPr>
-          <w:b/>
-          <w:bCs/>
-          <w:sz w:val="14"/>
-          <w:szCs w:val="14"/>
-        </w:rPr>
-      </w:pPr>
-      <w:r>
-        <w:rPr>
-          <w:b/>
-          <w:bCs/>
-          <w:sz w:val="14"/>
-          <w:szCs w:val="14"/>
-        </w:rPr>
-        <w:t>RUN npm run build</w:t>
-      </w:r>
-    </w:p>
-    <w:p>
-      <w:pPr>
-        <w:spacing w:after="0" w:line="240" w:lineRule="auto"/>
-        <w:rPr>
-          <w:b/>
-          <w:bCs/>
-          <w:sz w:val="14"/>
-          <w:szCs w:val="14"/>
-        </w:rPr>
-      </w:pPr>
-    </w:p>
-    <w:p>
-      <w:pPr>
-        <w:spacing w:after="0" w:line="240" w:lineRule="auto"/>
-        <w:rPr>
-          <w:b/>
-          <w:bCs/>
-          <w:sz w:val="14"/>
-          <w:szCs w:val="14"/>
-        </w:rPr>
-      </w:pPr>
-      <w:r>
-        <w:rPr>
-          <w:b/>
-          <w:bCs/>
-          <w:sz w:val="14"/>
-          <w:szCs w:val="14"/>
-        </w:rPr>
-        <w:t>FROM node:22-alpine</w:t>
-      </w:r>
-    </w:p>
-    <w:p>
-      <w:pPr>
-        <w:spacing w:after="0" w:line="240" w:lineRule="auto"/>
-        <w:rPr>
-          <w:b/>
-          <w:bCs/>
-          <w:sz w:val="14"/>
-          <w:szCs w:val="14"/>
-        </w:rPr>
-      </w:pPr>
-      <w:r>
-        <w:rPr>
-          <w:b/>
-          <w:bCs/>
-          <w:sz w:val="14"/>
-          <w:szCs w:val="14"/>
-        </w:rPr>
-        <w:t>WORKDIR /app</w:t>
-      </w:r>
-    </w:p>
-    <w:p>
-      <w:pPr>
-        <w:spacing w:after="0" w:line="240" w:lineRule="auto"/>
-        <w:rPr>
-          <w:b/>
-          <w:bCs/>
-          <w:sz w:val="14"/>
-          <w:szCs w:val="14"/>
-        </w:rPr>
-      </w:pPr>
-      <w:r>
-        <w:rPr>
-          <w:b/>
-          <w:bCs/>
-          <w:sz w:val="14"/>
-          <w:szCs w:val="14"/>
-        </w:rPr>
-        <w:t>COPY --from=builder /app/dist ./dist</w:t>
-      </w:r>
-    </w:p>
-    <w:p>
-      <w:pPr>
-        <w:spacing w:after="0" w:line="240" w:lineRule="auto"/>
-        <w:rPr>
-          <w:b/>
-          <w:bCs/>
-          <w:sz w:val="14"/>
-          <w:szCs w:val="14"/>
-        </w:rPr>
-      </w:pPr>
-      <w:r>
-        <w:rPr>
-          <w:b/>
-          <w:bCs/>
-          <w:sz w:val="14"/>
-          <w:szCs w:val="14"/>
-        </w:rPr>
-        <w:t>COPY --from=builder /app/node_modules ./node_modules</w:t>
-      </w:r>
-    </w:p>
-    <w:p>
-      <w:pPr>
-        <w:spacing w:after="0" w:line="240" w:lineRule="auto"/>
-        <w:rPr>
-          <w:b/>
-          <w:bCs/>
-          <w:sz w:val="14"/>
-          <w:szCs w:val="14"/>
-        </w:rPr>
-      </w:pPr>
-      <w:r>
-        <w:rPr>
-          <w:b/>
-          <w:bCs/>
-          <w:sz w:val="14"/>
-          <w:szCs w:val="14"/>
-        </w:rPr>
-        <w:t>ENV DEPLOYMENT_MODE=sovereign</w:t>
-      </w:r>
-    </w:p>
-    <w:p>
-      <w:pPr>
-        <w:spacing w:after="0" w:line="240" w:lineRule="auto"/>
-        <w:rPr>
-          <w:b/>
-          <w:bCs/>
-          <w:sz w:val="14"/>
-          <w:szCs w:val="14"/>
-        </w:rPr>
-      </w:pPr>
-      <w:r>
-        <w:rPr>
-          <w:b/>
-          <w:bCs/>
-          <w:sz w:val="14"/>
-          <w:szCs w:val="14"/>
-        </w:rPr>
-        <w:t>ENV EXCLUDE_INTELLME_CLIENT=true</w:t>
-      </w:r>
-    </w:p>
-    <w:p>
-      <w:pPr>
-        <w:spacing w:after="0" w:line="240" w:lineRule="auto"/>
-        <w:rPr>
-          <w:b/>
-          <w:bCs/>
-          <w:sz w:val="14"/>
-          <w:szCs w:val="14"/>
-        </w:rPr>
-      </w:pPr>
-      <w:r>
-        <w:rPr>
-          <w:b/>
-          <w:bCs/>
-          <w:sz w:val="14"/>
-          <w:szCs w:val="14"/>
-        </w:rPr>
-        <w:t>CMD ["node", "dist/index.js"]</w:t>
-      </w:r>
-    </w:p>
-    <w:p>
-      <w:pPr>
-        <w:spacing w:after="0" w:line="240" w:lineRule="auto"/>
-        <w:rPr>
-          <w:b/>
-          <w:bCs/>
-          <w:sz w:val="14"/>
-          <w:szCs w:val="14"/>
-        </w:rPr>
-      </w:pPr>
-      <w:r>
-        <w:rPr>
-          <w:b/>
-          <w:bCs/>
-          <w:sz w:val="14"/>
-          <w:szCs w:val="14"/>
-        </w:rPr>
-        <w:t>Acceptance criteria:</w:t>
-      </w:r>
-    </w:p>
-    <w:p>
-      <w:pPr>
-        <w:numPr>
-          <w:ilvl w:val="0"/>
-          <w:numId w:val="58"/>
-        </w:numPr>
-        <w:spacing w:after="0" w:line="240" w:lineRule="auto"/>
-        <w:rPr>
-          <w:b/>
-          <w:bCs/>
-          <w:sz w:val="14"/>
-          <w:szCs w:val="14"/>
-        </w:rPr>
-      </w:pPr>
-      <w:r>
-        <w:rPr>
-          <w:b/>
-          <w:bCs/>
-          <w:sz w:val="14"/>
-          <w:szCs w:val="14"/>
-        </w:rPr>
-        <w:t>B2C build (default) imports the real intellmeClient</w:t>
-      </w:r>
-    </w:p>
-    <w:p>
-      <w:pPr>
-        <w:numPr>
-          <w:ilvl w:val="0"/>
-          <w:numId w:val="58"/>
-        </w:numPr>
-        <w:spacing w:after="0" w:line="240" w:lineRule="auto"/>
-        <w:rPr>
-          <w:b/>
-          <w:bCs/>
-          <w:sz w:val="14"/>
-          <w:szCs w:val="14"/>
-        </w:rPr>
-      </w:pPr>
-      <w:r>
-        <w:rPr>
-          <w:b/>
-          <w:bCs/>
-          <w:sz w:val="14"/>
-          <w:szCs w:val="14"/>
-        </w:rPr>
-        <w:t>Sovereign build (with EXCLUDE_INTELLME_CLIENT=true) imports the stub</w:t>
-      </w:r>
-    </w:p>
-    <w:p>
-      <w:pPr>
-        <w:numPr>
-          <w:ilvl w:val="0"/>
-          <w:numId w:val="58"/>
-        </w:numPr>
-        <w:spacing w:after="0" w:line="240" w:lineRule="auto"/>
-        <w:rPr>
-          <w:b/>
-          <w:bCs/>
-          <w:sz w:val="14"/>
-          <w:szCs w:val="14"/>
-        </w:rPr>
-      </w:pPr>
-      <w:r>
-        <w:rPr>
-          <w:b/>
-          <w:bCs/>
-          <w:sz w:val="14"/>
-          <w:szCs w:val="14"/>
-        </w:rPr>
-        <w:t>Stub throws on any call</w:t>
-      </w:r>
-    </w:p>
-    <w:p>
-      <w:pPr>
-        <w:numPr>
-          <w:ilvl w:val="0"/>
-          <w:numId w:val="58"/>
-        </w:numPr>
-        <w:spacing w:after="0" w:line="240" w:lineRule="auto"/>
-        <w:rPr>
-          <w:b/>
-          <w:bCs/>
-          <w:sz w:val="14"/>
-          <w:szCs w:val="14"/>
-        </w:rPr>
-      </w:pPr>
-      <w:r>
-        <w:rPr>
-          <w:b/>
-          <w:bCs/>
-          <w:sz w:val="14"/>
-          <w:szCs w:val="14"/>
-        </w:rPr>
-        <w:t>Provisioning checklist documents the steps to onboard a Sovereign customer</w:t>
-      </w:r>
-    </w:p>
-    <w:p>
-      <w:pPr>
-        <w:numPr>
-          <w:ilvl w:val="0"/>
-          <w:numId w:val="58"/>
-        </w:numPr>
-        <w:spacing w:after="0" w:line="240" w:lineRule="auto"/>
-        <w:rPr>
-          <w:b/>
-          <w:bCs/>
-          <w:sz w:val="14"/>
-          <w:szCs w:val="14"/>
-        </w:rPr>
-      </w:pPr>
-      <w:r>
-        <w:rPr>
-          <w:b/>
-          <w:bCs/>
-          <w:sz w:val="14"/>
-          <w:szCs w:val="14"/>
-        </w:rPr>
-        <w:t>Tier middleware: tier=sovereign users have pipeline_b_eligible=false regardless of any consent setting (defense layer 1)</w:t>
-      </w:r>
-    </w:p>
-    <w:p>
-      <w:pPr>
-        <w:spacing w:after="0" w:line="240" w:lineRule="auto"/>
-        <w:rPr>
-          <w:b/>
-          <w:bCs/>
-          <w:sz w:val="14"/>
-          <w:szCs w:val="14"/>
-        </w:rPr>
-      </w:pPr>
-      <w:r>
-        <w:rPr>
-          <w:b/>
-          <w:bCs/>
-          <w:sz w:val="14"/>
-          <w:szCs w:val="14"/>
-        </w:rPr>
-        <w:t>Tests required:</w:t>
-      </w:r>
-    </w:p>
-    <w:p>
-      <w:pPr>
-        <w:numPr>
-          <w:ilvl w:val="0"/>
-          <w:numId w:val="59"/>
-        </w:numPr>
-        <w:spacing w:after="0" w:line="240" w:lineRule="auto"/>
-        <w:rPr>
-          <w:b/>
-          <w:bCs/>
-          <w:sz w:val="14"/>
-          <w:szCs w:val="14"/>
-        </w:rPr>
-      </w:pPr>
-      <w:r>
-        <w:rPr>
-          <w:b/>
-          <w:bCs/>
-          <w:sz w:val="14"/>
-          <w:szCs w:val="14"/>
-        </w:rPr>
-        <w:t>Build with default env → import the real client; build with sovereign env → import the stub. Validate via dependency-injection test.</w:t>
-      </w:r>
-    </w:p>
-    <w:p>
-      <w:pPr>
-        <w:numPr>
-          <w:ilvl w:val="0"/>
-          <w:numId w:val="59"/>
-        </w:numPr>
-        <w:spacing w:after="0" w:line="240" w:lineRule="auto"/>
-        <w:rPr>
-          <w:b/>
-          <w:bCs/>
-          <w:sz w:val="14"/>
-          <w:szCs w:val="14"/>
-        </w:rPr>
-      </w:pPr>
-      <w:r>
-        <w:rPr>
-          <w:b/>
-          <w:bCs/>
-          <w:sz w:val="14"/>
-          <w:szCs w:val="14"/>
-        </w:rPr>
-        <w:t>Stub call throws.</w:t>
-      </w:r>
-    </w:p>
-    <w:p>
-      <w:pPr>
-        <w:numPr>
-          <w:ilvl w:val="0"/>
-          <w:numId w:val="59"/>
-        </w:numPr>
-        <w:spacing w:after="0" w:line="240" w:lineRule="auto"/>
-        <w:rPr>
-          <w:b/>
-          <w:bCs/>
-          <w:sz w:val="14"/>
-          <w:szCs w:val="14"/>
-        </w:rPr>
-      </w:pPr>
-      <w:r>
-        <w:rPr>
-          <w:b/>
-          <w:bCs/>
-          <w:sz w:val="14"/>
-          <w:szCs w:val="14"/>
-        </w:rPr>
-        <w:t>Sovereign-tier user run lifecycle does not enqueue a pipeline_b_ingestion job (verify queue is empty post-run).</w:t>
-      </w:r>
-    </w:p>
-    <w:p>
-      <w:pPr>
-        <w:spacing w:after="0" w:line="240" w:lineRule="auto"/>
-        <w:rPr>
-          <w:b/>
-          <w:bCs/>
-          <w:sz w:val="14"/>
-          <w:szCs w:val="14"/>
-        </w:rPr>
-      </w:pPr>
-      <w:r>
-        <w:rPr>
-          <w:b/>
-          <w:bCs/>
-          <w:sz w:val="14"/>
-          <w:szCs w:val="14"/>
-        </w:rPr>
-        <w:t>What not to change.</w:t>
-      </w:r>
-    </w:p>
-    <w:p>
-      <w:pPr>
-        <w:numPr>
-          <w:ilvl w:val="0"/>
-          <w:numId w:val="60"/>
-        </w:numPr>
-        <w:spacing w:after="0" w:line="240" w:lineRule="auto"/>
-        <w:rPr>
-          <w:b/>
-          <w:bCs/>
-          <w:sz w:val="14"/>
-          <w:szCs w:val="14"/>
-        </w:rPr>
-      </w:pPr>
-      <w:r>
-        <w:rPr>
-          <w:b/>
-          <w:bCs/>
-          <w:sz w:val="14"/>
-          <w:szCs w:val="14"/>
-        </w:rPr>
-        <w:t>Existing B2C deployment behavior</w:t>
-      </w:r>
-    </w:p>
-    <w:p>
-      <w:pPr>
-        <w:numPr>
-          <w:ilvl w:val="0"/>
-          <w:numId w:val="60"/>
-        </w:numPr>
-        <w:spacing w:after="0" w:line="240" w:lineRule="auto"/>
-        <w:rPr>
-          <w:b/>
-          <w:bCs/>
-          <w:sz w:val="14"/>
-          <w:szCs w:val="14"/>
-        </w:rPr>
-      </w:pPr>
-      <w:r>
-        <w:rPr>
-          <w:b/>
-          <w:bCs/>
-          <w:sz w:val="14"/>
-          <w:szCs w:val="14"/>
-        </w:rPr>
-        <w:t>Any tier other than sovereign</w:t>
-      </w:r>
-    </w:p>
+    <w:bookmarkEnd w:id="1"/>
     <w:p/>
     <w:sectPr>
       <w:pgSz w:w="12240" w:h="20160" w:code="5"/>
@@ -1514,6 +1559,83 @@
 <file path=word/numbering.xml><?xml version="1.0" encoding="utf-8"?>
 <w:numbering xmlns:wpc="http://schemas.microsoft.com/office/word/2010/wordprocessingCanvas" xmlns:cx="http://schemas.microsoft.com/office/drawing/2014/chartex" xmlns:cx1="http://schemas.microsoft.com/office/drawing/2015/9/8/chartex" xmlns:cx2="http://schemas.microsoft.com/office/drawing/2015/10/21/chartex" xmlns:cx3="http://schemas.microsoft.com/office/drawing/2016/5/9/chartex" xmlns:cx4="http://schemas.microsoft.com/office/drawing/2016/5/10/chartex" xmlns:cx5="http://schemas.microsoft.com/office/drawing/2016/5/11/chartex" xmlns:cx6="http://schemas.microsoft.com/office/drawing/2016/5/12/chartex" xmlns:cx7="http://schemas.microsoft.com/office/drawing/2016/5/13/chartex" xmlns:cx8="http://schemas.microsoft.com/office/drawing/2016/5/14/chartex" xmlns:mc="http://schemas.openxmlformats.org/markup-compatibility/2006" xmlns:aink="http://schemas.microsoft.com/office/drawing/2016/ink" xmlns:am3d="http://schemas.microsoft.com/office/drawing/2017/model3d" xmlns:o="urn:schemas-microsoft-com:office:office" xmlns:oel="http://schemas.microsoft.com/office/2019/extlst" xmlns:r="http://schemas.openxmlformats.org/officeDocument/2006/relationships" xmlns:m="http://schemas.openxmlformats.org/officeDocument/2006/math" xmlns:v="urn:schemas-microsoft-com:vml" xmlns:wp14="http://schemas.microsoft.com/office/word/2010/wordprocessingDrawing" xmlns:wp="http://schemas.openxmlformats.org/drawingml/2006/wordprocessingDrawing" xmlns:w10="urn:schemas-microsoft-com:office:word" xmlns:w="http://schemas.openxmlformats.org/wordprocessingml/2006/main" xmlns:w14="http://schemas.microsoft.com/office/word/2010/wordml" xmlns:w15="http://schemas.microsoft.com/office/word/2012/wordml" xmlns:w16cex="http://schemas.microsoft.com/office/word/2018/wordml/cex" xmlns:w16cid="http://schemas.microsoft.com/office/word/2016/wordml/cid" xmlns:w16="http://schemas.microsoft.com/office/word/2018/wordml" xmlns:w16du="http://schemas.microsoft.com/office/word/2023/wordml/word16du" xmlns:w16sdtdh="http://schemas.microsoft.com/office/word/2020/wordml/sdtdatahash" xmlns:w16sdtfl="http://schemas.microsoft.com/office/word/2024/wordml/sdtformatlock" xmlns:w16se="http://schemas.microsoft.com/office/word/2015/wordml/symex" xmlns:wpg="http://schemas.microsoft.com/office/word/2010/wordprocessingGroup" xmlns:wpi="http://schemas.microsoft.com/office/word/2010/wordprocessingInk" xmlns:wne="http://schemas.microsoft.com/office/word/2006/wordml" xmlns:wps="http://schemas.microsoft.com/office/word/2010/wordprocessingShape" mc:Ignorable="w14 w15 w16se w16cid w16 w16cex w16sdtdh w16sdtfl w16du wp14">
   <w:abstractNum w:abstractNumId="0" w15:restartNumberingAfterBreak="0">
+    <w:nsid w:val="0000A991"/>
+    <w:multiLevelType w:val="multilevel"/>
+    <w:tmpl w:val="052E24CC"/>
+    <w:lvl w:ilvl="0">
+      <w:numFmt w:val="bullet"/>
+      <w:lvlText w:val="•"/>
+      <w:lvlJc w:val="left"/>
+      <w:pPr>
+        <w:ind w:left="720" w:hanging="480"/>
+      </w:pPr>
+    </w:lvl>
+    <w:lvl w:ilvl="1">
+      <w:numFmt w:val="bullet"/>
+      <w:lvlText w:val="–"/>
+      <w:lvlJc w:val="left"/>
+      <w:pPr>
+        <w:ind w:left="1440" w:hanging="480"/>
+      </w:pPr>
+    </w:lvl>
+    <w:lvl w:ilvl="2">
+      <w:numFmt w:val="bullet"/>
+      <w:lvlText w:val="•"/>
+      <w:lvlJc w:val="left"/>
+      <w:pPr>
+        <w:ind w:left="2160" w:hanging="480"/>
+      </w:pPr>
+    </w:lvl>
+    <w:lvl w:ilvl="3">
+      <w:numFmt w:val="bullet"/>
+      <w:lvlText w:val="–"/>
+      <w:lvlJc w:val="left"/>
+      <w:pPr>
+        <w:ind w:left="2880" w:hanging="480"/>
+      </w:pPr>
+    </w:lvl>
+    <w:lvl w:ilvl="4">
+      <w:numFmt w:val="bullet"/>
+      <w:lvlText w:val="•"/>
+      <w:lvlJc w:val="left"/>
+      <w:pPr>
+        <w:ind w:left="3600" w:hanging="480"/>
+      </w:pPr>
+    </w:lvl>
+    <w:lvl w:ilvl="5">
+      <w:numFmt w:val="bullet"/>
+      <w:lvlText w:val="–"/>
+      <w:lvlJc w:val="left"/>
+      <w:pPr>
+        <w:ind w:left="4320" w:hanging="480"/>
+      </w:pPr>
+    </w:lvl>
+    <w:lvl w:ilvl="6">
+      <w:numFmt w:val="bullet"/>
+      <w:lvlText w:val="•"/>
+      <w:lvlJc w:val="left"/>
+      <w:pPr>
+        <w:ind w:left="5040" w:hanging="480"/>
+      </w:pPr>
+    </w:lvl>
+    <w:lvl w:ilvl="7">
+      <w:numFmt w:val="bullet"/>
+      <w:lvlText w:val="–"/>
+      <w:lvlJc w:val="left"/>
+      <w:pPr>
+        <w:ind w:left="5760" w:hanging="480"/>
+      </w:pPr>
+    </w:lvl>
+    <w:lvl w:ilvl="8">
+      <w:numFmt w:val="bullet"/>
+      <w:lvlText w:val="•"/>
+      <w:lvlJc w:val="left"/>
+      <w:pPr>
+        <w:ind w:left="6480" w:hanging="480"/>
+      </w:pPr>
+    </w:lvl>
+  </w:abstractNum>
+  <w:abstractNum w:abstractNumId="1" w15:restartNumberingAfterBreak="0">
     <w:nsid w:val="04333CE7"/>
     <w:multiLevelType w:val="multilevel"/>
     <w:tmpl w:val="7408D212"/>
@@ -1662,7 +1784,7 @@
       </w:rPr>
     </w:lvl>
   </w:abstractNum>
-  <w:abstractNum w:abstractNumId="1" w15:restartNumberingAfterBreak="0">
+  <w:abstractNum w:abstractNumId="2" w15:restartNumberingAfterBreak="0">
     <w:nsid w:val="071030E2"/>
     <w:multiLevelType w:val="multilevel"/>
     <w:tmpl w:val="FD6A757A"/>
@@ -1811,7 +1933,7 @@
       </w:rPr>
     </w:lvl>
   </w:abstractNum>
-  <w:abstractNum w:abstractNumId="2" w15:restartNumberingAfterBreak="0">
+  <w:abstractNum w:abstractNumId="3" w15:restartNumberingAfterBreak="0">
     <w:nsid w:val="09B50C53"/>
     <w:multiLevelType w:val="multilevel"/>
     <w:tmpl w:val="0F2EBB20"/>
@@ -1960,7 +2082,7 @@
       </w:rPr>
     </w:lvl>
   </w:abstractNum>
-  <w:abstractNum w:abstractNumId="3" w15:restartNumberingAfterBreak="0">
+  <w:abstractNum w:abstractNumId="4" w15:restartNumberingAfterBreak="0">
     <w:nsid w:val="11D70FFF"/>
     <w:multiLevelType w:val="multilevel"/>
     <w:tmpl w:val="A55A0940"/>
@@ -2109,7 +2231,7 @@
       </w:rPr>
     </w:lvl>
   </w:abstractNum>
-  <w:abstractNum w:abstractNumId="4" w15:restartNumberingAfterBreak="0">
+  <w:abstractNum w:abstractNumId="5" w15:restartNumberingAfterBreak="0">
     <w:nsid w:val="12D80BE6"/>
     <w:multiLevelType w:val="multilevel"/>
     <w:tmpl w:val="504CE074"/>
@@ -2258,7 +2380,7 @@
       </w:rPr>
     </w:lvl>
   </w:abstractNum>
-  <w:abstractNum w:abstractNumId="5" w15:restartNumberingAfterBreak="0">
+  <w:abstractNum w:abstractNumId="6" w15:restartNumberingAfterBreak="0">
     <w:nsid w:val="154F29F9"/>
     <w:multiLevelType w:val="multilevel"/>
     <w:tmpl w:val="CF36F632"/>
@@ -2407,7 +2529,7 @@
       </w:rPr>
     </w:lvl>
   </w:abstractNum>
-  <w:abstractNum w:abstractNumId="6" w15:restartNumberingAfterBreak="0">
+  <w:abstractNum w:abstractNumId="7" w15:restartNumberingAfterBreak="0">
     <w:nsid w:val="176E0094"/>
     <w:multiLevelType w:val="multilevel"/>
     <w:tmpl w:val="C4F0B574"/>
@@ -2556,7 +2678,7 @@
       </w:rPr>
     </w:lvl>
   </w:abstractNum>
-  <w:abstractNum w:abstractNumId="7" w15:restartNumberingAfterBreak="0">
+  <w:abstractNum w:abstractNumId="8" w15:restartNumberingAfterBreak="0">
     <w:nsid w:val="18147F4A"/>
     <w:multiLevelType w:val="multilevel"/>
     <w:tmpl w:val="05EA243E"/>
@@ -2705,7 +2827,7 @@
       </w:rPr>
     </w:lvl>
   </w:abstractNum>
-  <w:abstractNum w:abstractNumId="8" w15:restartNumberingAfterBreak="0">
+  <w:abstractNum w:abstractNumId="9" w15:restartNumberingAfterBreak="0">
     <w:nsid w:val="1864576D"/>
     <w:multiLevelType w:val="multilevel"/>
     <w:tmpl w:val="7CC043B4"/>
@@ -2854,7 +2976,7 @@
       </w:rPr>
     </w:lvl>
   </w:abstractNum>
-  <w:abstractNum w:abstractNumId="9" w15:restartNumberingAfterBreak="0">
+  <w:abstractNum w:abstractNumId="10" w15:restartNumberingAfterBreak="0">
     <w:nsid w:val="1B4D0A5A"/>
     <w:multiLevelType w:val="multilevel"/>
     <w:tmpl w:val="ACD26688"/>
@@ -3003,7 +3125,7 @@
       </w:rPr>
     </w:lvl>
   </w:abstractNum>
-  <w:abstractNum w:abstractNumId="10" w15:restartNumberingAfterBreak="0">
+  <w:abstractNum w:abstractNumId="11" w15:restartNumberingAfterBreak="0">
     <w:nsid w:val="1DF91516"/>
     <w:multiLevelType w:val="multilevel"/>
     <w:tmpl w:val="4EEE850E"/>
@@ -3152,7 +3274,7 @@
       </w:rPr>
     </w:lvl>
   </w:abstractNum>
-  <w:abstractNum w:abstractNumId="11" w15:restartNumberingAfterBreak="0">
+  <w:abstractNum w:abstractNumId="12" w15:restartNumberingAfterBreak="0">
     <w:nsid w:val="1E031A17"/>
     <w:multiLevelType w:val="multilevel"/>
     <w:tmpl w:val="1BB2D1E0"/>
@@ -3301,7 +3423,7 @@
       </w:rPr>
     </w:lvl>
   </w:abstractNum>
-  <w:abstractNum w:abstractNumId="12" w15:restartNumberingAfterBreak="0">
+  <w:abstractNum w:abstractNumId="13" w15:restartNumberingAfterBreak="0">
     <w:nsid w:val="1FBE6A88"/>
     <w:multiLevelType w:val="multilevel"/>
     <w:tmpl w:val="589CB48C"/>
@@ -3450,7 +3572,7 @@
       </w:rPr>
     </w:lvl>
   </w:abstractNum>
-  <w:abstractNum w:abstractNumId="13" w15:restartNumberingAfterBreak="0">
+  <w:abstractNum w:abstractNumId="14" w15:restartNumberingAfterBreak="0">
     <w:nsid w:val="22EA2F75"/>
     <w:multiLevelType w:val="multilevel"/>
     <w:tmpl w:val="C23855A4"/>
@@ -3599,7 +3721,7 @@
       </w:rPr>
     </w:lvl>
   </w:abstractNum>
-  <w:abstractNum w:abstractNumId="14" w15:restartNumberingAfterBreak="0">
+  <w:abstractNum w:abstractNumId="15" w15:restartNumberingAfterBreak="0">
     <w:nsid w:val="23620EA9"/>
     <w:multiLevelType w:val="multilevel"/>
     <w:tmpl w:val="161A4996"/>
@@ -3748,7 +3870,7 @@
       </w:rPr>
     </w:lvl>
   </w:abstractNum>
-  <w:abstractNum w:abstractNumId="15" w15:restartNumberingAfterBreak="0">
+  <w:abstractNum w:abstractNumId="16" w15:restartNumberingAfterBreak="0">
     <w:nsid w:val="23F81775"/>
     <w:multiLevelType w:val="multilevel"/>
     <w:tmpl w:val="49C0B8D0"/>
@@ -3897,7 +4019,7 @@
       </w:rPr>
     </w:lvl>
   </w:abstractNum>
-  <w:abstractNum w:abstractNumId="16" w15:restartNumberingAfterBreak="0">
+  <w:abstractNum w:abstractNumId="17" w15:restartNumberingAfterBreak="0">
     <w:nsid w:val="24C01B1F"/>
     <w:multiLevelType w:val="multilevel"/>
     <w:tmpl w:val="364C5990"/>
@@ -4046,7 +4168,7 @@
       </w:rPr>
     </w:lvl>
   </w:abstractNum>
-  <w:abstractNum w:abstractNumId="17" w15:restartNumberingAfterBreak="0">
+  <w:abstractNum w:abstractNumId="18" w15:restartNumberingAfterBreak="0">
     <w:nsid w:val="26484057"/>
     <w:multiLevelType w:val="multilevel"/>
     <w:tmpl w:val="249A8EFC"/>
@@ -4195,7 +4317,7 @@
       </w:rPr>
     </w:lvl>
   </w:abstractNum>
-  <w:abstractNum w:abstractNumId="18" w15:restartNumberingAfterBreak="0">
+  <w:abstractNum w:abstractNumId="19" w15:restartNumberingAfterBreak="0">
     <w:nsid w:val="2B3F41A8"/>
     <w:multiLevelType w:val="multilevel"/>
     <w:tmpl w:val="1CDEE8FE"/>
@@ -4344,7 +4466,7 @@
       </w:rPr>
     </w:lvl>
   </w:abstractNum>
-  <w:abstractNum w:abstractNumId="19" w15:restartNumberingAfterBreak="0">
+  <w:abstractNum w:abstractNumId="20" w15:restartNumberingAfterBreak="0">
     <w:nsid w:val="2CD76A07"/>
     <w:multiLevelType w:val="multilevel"/>
     <w:tmpl w:val="CD2A3D44"/>
@@ -4493,7 +4615,7 @@
       </w:rPr>
     </w:lvl>
   </w:abstractNum>
-  <w:abstractNum w:abstractNumId="20" w15:restartNumberingAfterBreak="0">
+  <w:abstractNum w:abstractNumId="21" w15:restartNumberingAfterBreak="0">
     <w:nsid w:val="2EE65A2B"/>
     <w:multiLevelType w:val="multilevel"/>
     <w:tmpl w:val="C472D116"/>
@@ -4642,7 +4764,7 @@
       </w:rPr>
     </w:lvl>
   </w:abstractNum>
-  <w:abstractNum w:abstractNumId="21" w15:restartNumberingAfterBreak="0">
+  <w:abstractNum w:abstractNumId="22" w15:restartNumberingAfterBreak="0">
     <w:nsid w:val="32C61770"/>
     <w:multiLevelType w:val="multilevel"/>
     <w:tmpl w:val="9FECB022"/>
@@ -4791,7 +4913,7 @@
       </w:rPr>
     </w:lvl>
   </w:abstractNum>
-  <w:abstractNum w:abstractNumId="22" w15:restartNumberingAfterBreak="0">
+  <w:abstractNum w:abstractNumId="23" w15:restartNumberingAfterBreak="0">
     <w:nsid w:val="33504C37"/>
     <w:multiLevelType w:val="multilevel"/>
     <w:tmpl w:val="1CD690E6"/>
@@ -4904,7 +5026,7 @@
       </w:pPr>
     </w:lvl>
   </w:abstractNum>
-  <w:abstractNum w:abstractNumId="23" w15:restartNumberingAfterBreak="0">
+  <w:abstractNum w:abstractNumId="24" w15:restartNumberingAfterBreak="0">
     <w:nsid w:val="377F44C5"/>
     <w:multiLevelType w:val="multilevel"/>
     <w:tmpl w:val="FC16A516"/>
@@ -5017,7 +5139,7 @@
       </w:pPr>
     </w:lvl>
   </w:abstractNum>
-  <w:abstractNum w:abstractNumId="24" w15:restartNumberingAfterBreak="0">
+  <w:abstractNum w:abstractNumId="25" w15:restartNumberingAfterBreak="0">
     <w:nsid w:val="3CA2407A"/>
     <w:multiLevelType w:val="multilevel"/>
     <w:tmpl w:val="85B4D402"/>
@@ -5166,7 +5288,7 @@
       </w:rPr>
     </w:lvl>
   </w:abstractNum>
-  <w:abstractNum w:abstractNumId="25" w15:restartNumberingAfterBreak="0">
+  <w:abstractNum w:abstractNumId="26" w15:restartNumberingAfterBreak="0">
     <w:nsid w:val="4055336B"/>
     <w:multiLevelType w:val="multilevel"/>
     <w:tmpl w:val="982C692C"/>
@@ -5315,7 +5437,7 @@
       </w:rPr>
     </w:lvl>
   </w:abstractNum>
-  <w:abstractNum w:abstractNumId="26" w15:restartNumberingAfterBreak="0">
+  <w:abstractNum w:abstractNumId="27" w15:restartNumberingAfterBreak="0">
     <w:nsid w:val="409546B1"/>
     <w:multiLevelType w:val="multilevel"/>
     <w:tmpl w:val="7AD23922"/>
@@ -5464,7 +5586,7 @@
       </w:rPr>
     </w:lvl>
   </w:abstractNum>
-  <w:abstractNum w:abstractNumId="27" w15:restartNumberingAfterBreak="0">
+  <w:abstractNum w:abstractNumId="28" w15:restartNumberingAfterBreak="0">
     <w:nsid w:val="41603577"/>
     <w:multiLevelType w:val="multilevel"/>
     <w:tmpl w:val="C3D08FF6"/>
@@ -5613,7 +5735,7 @@
       </w:rPr>
     </w:lvl>
   </w:abstractNum>
-  <w:abstractNum w:abstractNumId="28" w15:restartNumberingAfterBreak="0">
+  <w:abstractNum w:abstractNumId="29" w15:restartNumberingAfterBreak="0">
     <w:nsid w:val="42992D54"/>
     <w:multiLevelType w:val="multilevel"/>
     <w:tmpl w:val="38BE31EE"/>
@@ -5762,7 +5884,7 @@
       </w:rPr>
     </w:lvl>
   </w:abstractNum>
-  <w:abstractNum w:abstractNumId="29" w15:restartNumberingAfterBreak="0">
+  <w:abstractNum w:abstractNumId="30" w15:restartNumberingAfterBreak="0">
     <w:nsid w:val="44E42CE5"/>
     <w:multiLevelType w:val="multilevel"/>
     <w:tmpl w:val="3620B8DA"/>
@@ -5911,7 +6033,7 @@
       </w:rPr>
     </w:lvl>
   </w:abstractNum>
-  <w:abstractNum w:abstractNumId="30" w15:restartNumberingAfterBreak="0">
+  <w:abstractNum w:abstractNumId="31" w15:restartNumberingAfterBreak="0">
     <w:nsid w:val="45767E68"/>
     <w:multiLevelType w:val="multilevel"/>
     <w:tmpl w:val="4A2CD5A0"/>
@@ -6060,7 +6182,7 @@
       </w:rPr>
     </w:lvl>
   </w:abstractNum>
-  <w:abstractNum w:abstractNumId="31" w15:restartNumberingAfterBreak="0">
+  <w:abstractNum w:abstractNumId="32" w15:restartNumberingAfterBreak="0">
     <w:nsid w:val="46DE7BB8"/>
     <w:multiLevelType w:val="multilevel"/>
     <w:tmpl w:val="1A7685F0"/>
@@ -6209,7 +6331,7 @@
       </w:rPr>
     </w:lvl>
   </w:abstractNum>
-  <w:abstractNum w:abstractNumId="32" w15:restartNumberingAfterBreak="0">
+  <w:abstractNum w:abstractNumId="33" w15:restartNumberingAfterBreak="0">
     <w:nsid w:val="46E04D99"/>
     <w:multiLevelType w:val="multilevel"/>
     <w:tmpl w:val="3E4E88E6"/>
@@ -6358,7 +6480,7 @@
       </w:rPr>
     </w:lvl>
   </w:abstractNum>
-  <w:abstractNum w:abstractNumId="33" w15:restartNumberingAfterBreak="0">
+  <w:abstractNum w:abstractNumId="34" w15:restartNumberingAfterBreak="0">
     <w:nsid w:val="483313BE"/>
     <w:multiLevelType w:val="multilevel"/>
     <w:tmpl w:val="3C5E5F9C"/>
@@ -6507,7 +6629,7 @@
       </w:rPr>
     </w:lvl>
   </w:abstractNum>
-  <w:abstractNum w:abstractNumId="34" w15:restartNumberingAfterBreak="0">
+  <w:abstractNum w:abstractNumId="35" w15:restartNumberingAfterBreak="0">
     <w:nsid w:val="489D7EFC"/>
     <w:multiLevelType w:val="multilevel"/>
     <w:tmpl w:val="AD7A950C"/>
@@ -6656,7 +6778,7 @@
       </w:rPr>
     </w:lvl>
   </w:abstractNum>
-  <w:abstractNum w:abstractNumId="35" w15:restartNumberingAfterBreak="0">
+  <w:abstractNum w:abstractNumId="36" w15:restartNumberingAfterBreak="0">
     <w:nsid w:val="4A5C7964"/>
     <w:multiLevelType w:val="multilevel"/>
     <w:tmpl w:val="7E02BAD6"/>
@@ -6805,7 +6927,7 @@
       </w:rPr>
     </w:lvl>
   </w:abstractNum>
-  <w:abstractNum w:abstractNumId="36" w15:restartNumberingAfterBreak="0">
+  <w:abstractNum w:abstractNumId="37" w15:restartNumberingAfterBreak="0">
     <w:nsid w:val="4C7F6565"/>
     <w:multiLevelType w:val="multilevel"/>
     <w:tmpl w:val="4378D422"/>
@@ -6954,7 +7076,7 @@
       </w:rPr>
     </w:lvl>
   </w:abstractNum>
-  <w:abstractNum w:abstractNumId="37" w15:restartNumberingAfterBreak="0">
+  <w:abstractNum w:abstractNumId="38" w15:restartNumberingAfterBreak="0">
     <w:nsid w:val="4CB451D4"/>
     <w:multiLevelType w:val="multilevel"/>
     <w:tmpl w:val="EAB0F586"/>
@@ -7103,7 +7225,7 @@
       </w:rPr>
     </w:lvl>
   </w:abstractNum>
-  <w:abstractNum w:abstractNumId="38" w15:restartNumberingAfterBreak="0">
+  <w:abstractNum w:abstractNumId="39" w15:restartNumberingAfterBreak="0">
     <w:nsid w:val="4F2D3ED7"/>
     <w:multiLevelType w:val="multilevel"/>
     <w:tmpl w:val="FE769DD4"/>
@@ -7252,7 +7374,7 @@
       </w:rPr>
     </w:lvl>
   </w:abstractNum>
-  <w:abstractNum w:abstractNumId="39" w15:restartNumberingAfterBreak="0">
+  <w:abstractNum w:abstractNumId="40" w15:restartNumberingAfterBreak="0">
     <w:nsid w:val="4F7A4D55"/>
     <w:multiLevelType w:val="multilevel"/>
     <w:tmpl w:val="1A44F77E"/>
@@ -7401,7 +7523,7 @@
       </w:rPr>
     </w:lvl>
   </w:abstractNum>
-  <w:abstractNum w:abstractNumId="40" w15:restartNumberingAfterBreak="0">
+  <w:abstractNum w:abstractNumId="41" w15:restartNumberingAfterBreak="0">
     <w:nsid w:val="4FF65213"/>
     <w:multiLevelType w:val="multilevel"/>
     <w:tmpl w:val="CBB43116"/>
@@ -7550,7 +7672,7 @@
       </w:rPr>
     </w:lvl>
   </w:abstractNum>
-  <w:abstractNum w:abstractNumId="41" w15:restartNumberingAfterBreak="0">
+  <w:abstractNum w:abstractNumId="42" w15:restartNumberingAfterBreak="0">
     <w:nsid w:val="508127CD"/>
     <w:multiLevelType w:val="multilevel"/>
     <w:tmpl w:val="27FE9862"/>
@@ -7699,7 +7821,7 @@
       </w:rPr>
     </w:lvl>
   </w:abstractNum>
-  <w:abstractNum w:abstractNumId="42" w15:restartNumberingAfterBreak="0">
+  <w:abstractNum w:abstractNumId="43" w15:restartNumberingAfterBreak="0">
     <w:nsid w:val="53984354"/>
     <w:multiLevelType w:val="multilevel"/>
     <w:tmpl w:val="7F22D4CA"/>
@@ -7848,7 +7970,7 @@
       </w:rPr>
     </w:lvl>
   </w:abstractNum>
-  <w:abstractNum w:abstractNumId="43" w15:restartNumberingAfterBreak="0">
+  <w:abstractNum w:abstractNumId="44" w15:restartNumberingAfterBreak="0">
     <w:nsid w:val="57952E5B"/>
     <w:multiLevelType w:val="multilevel"/>
     <w:tmpl w:val="0848011C"/>
@@ -7997,7 +8119,7 @@
       </w:rPr>
     </w:lvl>
   </w:abstractNum>
-  <w:abstractNum w:abstractNumId="44" w15:restartNumberingAfterBreak="0">
+  <w:abstractNum w:abstractNumId="45" w15:restartNumberingAfterBreak="0">
     <w:nsid w:val="5A1E6C02"/>
     <w:multiLevelType w:val="multilevel"/>
     <w:tmpl w:val="95208290"/>
@@ -8146,7 +8268,7 @@
       </w:rPr>
     </w:lvl>
   </w:abstractNum>
-  <w:abstractNum w:abstractNumId="45" w15:restartNumberingAfterBreak="0">
+  <w:abstractNum w:abstractNumId="46" w15:restartNumberingAfterBreak="0">
     <w:nsid w:val="5D392B6D"/>
     <w:multiLevelType w:val="multilevel"/>
     <w:tmpl w:val="4CB6710C"/>
@@ -8295,7 +8417,7 @@
       </w:rPr>
     </w:lvl>
   </w:abstractNum>
-  <w:abstractNum w:abstractNumId="46" w15:restartNumberingAfterBreak="0">
+  <w:abstractNum w:abstractNumId="47" w15:restartNumberingAfterBreak="0">
     <w:nsid w:val="645C770A"/>
     <w:multiLevelType w:val="multilevel"/>
     <w:tmpl w:val="279E2C78"/>
@@ -8444,7 +8566,7 @@
       </w:rPr>
     </w:lvl>
   </w:abstractNum>
-  <w:abstractNum w:abstractNumId="47" w15:restartNumberingAfterBreak="0">
+  <w:abstractNum w:abstractNumId="48" w15:restartNumberingAfterBreak="0">
     <w:nsid w:val="69116F7C"/>
     <w:multiLevelType w:val="multilevel"/>
     <w:tmpl w:val="7B3C147A"/>
@@ -8593,7 +8715,7 @@
       </w:rPr>
     </w:lvl>
   </w:abstractNum>
-  <w:abstractNum w:abstractNumId="48" w15:restartNumberingAfterBreak="0">
+  <w:abstractNum w:abstractNumId="49" w15:restartNumberingAfterBreak="0">
     <w:nsid w:val="691D51DE"/>
     <w:multiLevelType w:val="multilevel"/>
     <w:tmpl w:val="005873A0"/>
@@ -8742,7 +8864,7 @@
       </w:rPr>
     </w:lvl>
   </w:abstractNum>
-  <w:abstractNum w:abstractNumId="49" w15:restartNumberingAfterBreak="0">
+  <w:abstractNum w:abstractNumId="50" w15:restartNumberingAfterBreak="0">
     <w:nsid w:val="6F206C56"/>
     <w:multiLevelType w:val="multilevel"/>
     <w:tmpl w:val="C7823AD0"/>
@@ -8891,7 +9013,7 @@
       </w:rPr>
     </w:lvl>
   </w:abstractNum>
-  <w:abstractNum w:abstractNumId="50" w15:restartNumberingAfterBreak="0">
+  <w:abstractNum w:abstractNumId="51" w15:restartNumberingAfterBreak="0">
     <w:nsid w:val="6F7E7528"/>
     <w:multiLevelType w:val="multilevel"/>
     <w:tmpl w:val="A09E4560"/>
@@ -9040,7 +9162,7 @@
       </w:rPr>
     </w:lvl>
   </w:abstractNum>
-  <w:abstractNum w:abstractNumId="51" w15:restartNumberingAfterBreak="0">
+  <w:abstractNum w:abstractNumId="52" w15:restartNumberingAfterBreak="0">
     <w:nsid w:val="71824EC6"/>
     <w:multiLevelType w:val="multilevel"/>
     <w:tmpl w:val="AAA2BB46"/>
@@ -9189,7 +9311,7 @@
       </w:rPr>
     </w:lvl>
   </w:abstractNum>
-  <w:abstractNum w:abstractNumId="52" w15:restartNumberingAfterBreak="0">
+  <w:abstractNum w:abstractNumId="53" w15:restartNumberingAfterBreak="0">
     <w:nsid w:val="71F16D1B"/>
     <w:multiLevelType w:val="multilevel"/>
     <w:tmpl w:val="0C7C4082"/>
@@ -9338,7 +9460,7 @@
       </w:rPr>
     </w:lvl>
   </w:abstractNum>
-  <w:abstractNum w:abstractNumId="53" w15:restartNumberingAfterBreak="0">
+  <w:abstractNum w:abstractNumId="54" w15:restartNumberingAfterBreak="0">
     <w:nsid w:val="724A59FB"/>
     <w:multiLevelType w:val="multilevel"/>
     <w:tmpl w:val="75E68C5C"/>
@@ -9487,7 +9609,7 @@
       </w:rPr>
     </w:lvl>
   </w:abstractNum>
-  <w:abstractNum w:abstractNumId="54" w15:restartNumberingAfterBreak="0">
+  <w:abstractNum w:abstractNumId="55" w15:restartNumberingAfterBreak="0">
     <w:nsid w:val="7415299A"/>
     <w:multiLevelType w:val="multilevel"/>
     <w:tmpl w:val="78B2E146"/>
@@ -9636,7 +9758,7 @@
       </w:rPr>
     </w:lvl>
   </w:abstractNum>
-  <w:abstractNum w:abstractNumId="55" w15:restartNumberingAfterBreak="0">
+  <w:abstractNum w:abstractNumId="56" w15:restartNumberingAfterBreak="0">
     <w:nsid w:val="74385EDA"/>
     <w:multiLevelType w:val="multilevel"/>
     <w:tmpl w:val="2230E476"/>
@@ -9785,7 +9907,7 @@
       </w:rPr>
     </w:lvl>
   </w:abstractNum>
-  <w:abstractNum w:abstractNumId="56" w15:restartNumberingAfterBreak="0">
+  <w:abstractNum w:abstractNumId="57" w15:restartNumberingAfterBreak="0">
     <w:nsid w:val="789373EA"/>
     <w:multiLevelType w:val="multilevel"/>
     <w:tmpl w:val="3E2EC67A"/>
@@ -9934,7 +10056,7 @@
       </w:rPr>
     </w:lvl>
   </w:abstractNum>
-  <w:abstractNum w:abstractNumId="57" w15:restartNumberingAfterBreak="0">
+  <w:abstractNum w:abstractNumId="58" w15:restartNumberingAfterBreak="0">
     <w:nsid w:val="7D2E192B"/>
     <w:multiLevelType w:val="multilevel"/>
     <w:tmpl w:val="97A40908"/>
@@ -10083,7 +10205,7 @@
       </w:rPr>
     </w:lvl>
   </w:abstractNum>
-  <w:abstractNum w:abstractNumId="58" w15:restartNumberingAfterBreak="0">
+  <w:abstractNum w:abstractNumId="59" w15:restartNumberingAfterBreak="0">
     <w:nsid w:val="7D8536BB"/>
     <w:multiLevelType w:val="multilevel"/>
     <w:tmpl w:val="AF5E2110"/>
@@ -10232,7 +10354,7 @@
       </w:rPr>
     </w:lvl>
   </w:abstractNum>
-  <w:abstractNum w:abstractNumId="59" w15:restartNumberingAfterBreak="0">
+  <w:abstractNum w:abstractNumId="60" w15:restartNumberingAfterBreak="0">
     <w:nsid w:val="7F52360F"/>
     <w:multiLevelType w:val="multilevel"/>
     <w:tmpl w:val="200CF52A"/>
@@ -10382,184 +10504,187 @@
     </w:lvl>
   </w:abstractNum>
   <w:num w:numId="1" w16cid:durableId="2136679740">
+    <w:abstractNumId w:val="25"/>
+  </w:num>
+  <w:num w:numId="2" w16cid:durableId="1788238221">
+    <w:abstractNumId w:val="11"/>
+  </w:num>
+  <w:num w:numId="3" w16cid:durableId="1166824005">
+    <w:abstractNumId w:val="35"/>
+  </w:num>
+  <w:num w:numId="4" w16cid:durableId="1764573601">
+    <w:abstractNumId w:val="55"/>
+  </w:num>
+  <w:num w:numId="5" w16cid:durableId="188764800">
+    <w:abstractNumId w:val="52"/>
+  </w:num>
+  <w:num w:numId="6" w16cid:durableId="510727720">
+    <w:abstractNumId w:val="28"/>
+  </w:num>
+  <w:num w:numId="7" w16cid:durableId="640309829">
+    <w:abstractNumId w:val="17"/>
+  </w:num>
+  <w:num w:numId="8" w16cid:durableId="551695342">
+    <w:abstractNumId w:val="45"/>
+  </w:num>
+  <w:num w:numId="9" w16cid:durableId="2020934423">
+    <w:abstractNumId w:val="44"/>
+  </w:num>
+  <w:num w:numId="10" w16cid:durableId="511997346">
+    <w:abstractNumId w:val="27"/>
+  </w:num>
+  <w:num w:numId="11" w16cid:durableId="1846480219">
+    <w:abstractNumId w:val="9"/>
+  </w:num>
+  <w:num w:numId="12" w16cid:durableId="1578514191">
+    <w:abstractNumId w:val="1"/>
+  </w:num>
+  <w:num w:numId="13" w16cid:durableId="378089779">
+    <w:abstractNumId w:val="56"/>
+  </w:num>
+  <w:num w:numId="14" w16cid:durableId="1104618906">
+    <w:abstractNumId w:val="16"/>
+  </w:num>
+  <w:num w:numId="15" w16cid:durableId="360474818">
+    <w:abstractNumId w:val="23"/>
+  </w:num>
+  <w:num w:numId="16" w16cid:durableId="244581054">
+    <w:abstractNumId w:val="19"/>
+  </w:num>
+  <w:num w:numId="17" w16cid:durableId="839854522">
+    <w:abstractNumId w:val="47"/>
+  </w:num>
+  <w:num w:numId="18" w16cid:durableId="1388256806">
+    <w:abstractNumId w:val="59"/>
+  </w:num>
+  <w:num w:numId="19" w16cid:durableId="1786383631">
+    <w:abstractNumId w:val="43"/>
+  </w:num>
+  <w:num w:numId="20" w16cid:durableId="1632053132">
     <w:abstractNumId w:val="24"/>
   </w:num>
-  <w:num w:numId="2" w16cid:durableId="1788238221">
+  <w:num w:numId="21" w16cid:durableId="484711823">
+    <w:abstractNumId w:val="49"/>
+  </w:num>
+  <w:num w:numId="22" w16cid:durableId="1459107919">
+    <w:abstractNumId w:val="20"/>
+  </w:num>
+  <w:num w:numId="23" w16cid:durableId="132724233">
+    <w:abstractNumId w:val="54"/>
+  </w:num>
+  <w:num w:numId="24" w16cid:durableId="1067145093">
+    <w:abstractNumId w:val="33"/>
+  </w:num>
+  <w:num w:numId="25" w16cid:durableId="1818378657">
+    <w:abstractNumId w:val="29"/>
+  </w:num>
+  <w:num w:numId="26" w16cid:durableId="2016879665">
+    <w:abstractNumId w:val="58"/>
+  </w:num>
+  <w:num w:numId="27" w16cid:durableId="1896968251">
+    <w:abstractNumId w:val="13"/>
+  </w:num>
+  <w:num w:numId="28" w16cid:durableId="791751936">
+    <w:abstractNumId w:val="46"/>
+  </w:num>
+  <w:num w:numId="29" w16cid:durableId="2093428565">
+    <w:abstractNumId w:val="14"/>
+  </w:num>
+  <w:num w:numId="30" w16cid:durableId="1461802735">
+    <w:abstractNumId w:val="7"/>
+  </w:num>
+  <w:num w:numId="31" w16cid:durableId="500049884">
+    <w:abstractNumId w:val="36"/>
+  </w:num>
+  <w:num w:numId="32" w16cid:durableId="1257860979">
+    <w:abstractNumId w:val="41"/>
+  </w:num>
+  <w:num w:numId="33" w16cid:durableId="1856532754">
+    <w:abstractNumId w:val="38"/>
+  </w:num>
+  <w:num w:numId="34" w16cid:durableId="670717859">
+    <w:abstractNumId w:val="3"/>
+  </w:num>
+  <w:num w:numId="35" w16cid:durableId="33429240">
+    <w:abstractNumId w:val="30"/>
+  </w:num>
+  <w:num w:numId="36" w16cid:durableId="840660728">
+    <w:abstractNumId w:val="39"/>
+  </w:num>
+  <w:num w:numId="37" w16cid:durableId="752552443">
+    <w:abstractNumId w:val="40"/>
+  </w:num>
+  <w:num w:numId="38" w16cid:durableId="1891113332">
     <w:abstractNumId w:val="10"/>
   </w:num>
-  <w:num w:numId="3" w16cid:durableId="1166824005">
+  <w:num w:numId="39" w16cid:durableId="1012100508">
+    <w:abstractNumId w:val="15"/>
+  </w:num>
+  <w:num w:numId="40" w16cid:durableId="733747314">
+    <w:abstractNumId w:val="26"/>
+  </w:num>
+  <w:num w:numId="41" w16cid:durableId="1615207630">
+    <w:abstractNumId w:val="57"/>
+  </w:num>
+  <w:num w:numId="42" w16cid:durableId="1209685121">
+    <w:abstractNumId w:val="22"/>
+  </w:num>
+  <w:num w:numId="43" w16cid:durableId="1432508296">
+    <w:abstractNumId w:val="8"/>
+  </w:num>
+  <w:num w:numId="44" w16cid:durableId="1671713202">
+    <w:abstractNumId w:val="37"/>
+  </w:num>
+  <w:num w:numId="45" w16cid:durableId="558441367">
+    <w:abstractNumId w:val="53"/>
+  </w:num>
+  <w:num w:numId="46" w16cid:durableId="1301769755">
+    <w:abstractNumId w:val="6"/>
+  </w:num>
+  <w:num w:numId="47" w16cid:durableId="1255700740">
+    <w:abstractNumId w:val="42"/>
+  </w:num>
+  <w:num w:numId="48" w16cid:durableId="1613516090">
+    <w:abstractNumId w:val="51"/>
+  </w:num>
+  <w:num w:numId="49" w16cid:durableId="1287657885">
+    <w:abstractNumId w:val="50"/>
+  </w:num>
+  <w:num w:numId="50" w16cid:durableId="465047122">
     <w:abstractNumId w:val="34"/>
   </w:num>
-  <w:num w:numId="4" w16cid:durableId="1764573601">
-    <w:abstractNumId w:val="54"/>
+  <w:num w:numId="51" w16cid:durableId="421881451">
+    <w:abstractNumId w:val="4"/>
   </w:num>
-  <w:num w:numId="5" w16cid:durableId="188764800">
-    <w:abstractNumId w:val="51"/>
+  <w:num w:numId="52" w16cid:durableId="1944459059">
+    <w:abstractNumId w:val="48"/>
   </w:num>
-  <w:num w:numId="6" w16cid:durableId="510727720">
-    <w:abstractNumId w:val="27"/>
-  </w:num>
-  <w:num w:numId="7" w16cid:durableId="640309829">
-    <w:abstractNumId w:val="16"/>
-  </w:num>
-  <w:num w:numId="8" w16cid:durableId="551695342">
-    <w:abstractNumId w:val="44"/>
-  </w:num>
-  <w:num w:numId="9" w16cid:durableId="2020934423">
-    <w:abstractNumId w:val="43"/>
-  </w:num>
-  <w:num w:numId="10" w16cid:durableId="511997346">
-    <w:abstractNumId w:val="26"/>
-  </w:num>
-  <w:num w:numId="11" w16cid:durableId="1846480219">
-    <w:abstractNumId w:val="8"/>
-  </w:num>
-  <w:num w:numId="12" w16cid:durableId="1578514191">
-    <w:abstractNumId w:val="0"/>
-  </w:num>
-  <w:num w:numId="13" w16cid:durableId="378089779">
-    <w:abstractNumId w:val="55"/>
-  </w:num>
-  <w:num w:numId="14" w16cid:durableId="1104618906">
-    <w:abstractNumId w:val="15"/>
-  </w:num>
-  <w:num w:numId="15" w16cid:durableId="360474818">
-    <w:abstractNumId w:val="22"/>
-  </w:num>
-  <w:num w:numId="16" w16cid:durableId="244581054">
+  <w:num w:numId="53" w16cid:durableId="2013679682">
     <w:abstractNumId w:val="18"/>
   </w:num>
-  <w:num w:numId="17" w16cid:durableId="839854522">
-    <w:abstractNumId w:val="46"/>
+  <w:num w:numId="54" w16cid:durableId="2054498748">
+    <w:abstractNumId w:val="21"/>
   </w:num>
-  <w:num w:numId="18" w16cid:durableId="1388256806">
-    <w:abstractNumId w:val="58"/>
-  </w:num>
-  <w:num w:numId="19" w16cid:durableId="1786383631">
-    <w:abstractNumId w:val="42"/>
-  </w:num>
-  <w:num w:numId="20" w16cid:durableId="1632053132">
-    <w:abstractNumId w:val="23"/>
-  </w:num>
-  <w:num w:numId="21" w16cid:durableId="484711823">
-    <w:abstractNumId w:val="48"/>
-  </w:num>
-  <w:num w:numId="22" w16cid:durableId="1459107919">
-    <w:abstractNumId w:val="19"/>
-  </w:num>
-  <w:num w:numId="23" w16cid:durableId="132724233">
-    <w:abstractNumId w:val="53"/>
-  </w:num>
-  <w:num w:numId="24" w16cid:durableId="1067145093">
+  <w:num w:numId="55" w16cid:durableId="1921984355">
     <w:abstractNumId w:val="32"/>
   </w:num>
-  <w:num w:numId="25" w16cid:durableId="1818378657">
-    <w:abstractNumId w:val="28"/>
+  <w:num w:numId="56" w16cid:durableId="1866945447">
+    <w:abstractNumId w:val="31"/>
   </w:num>
-  <w:num w:numId="26" w16cid:durableId="2016879665">
-    <w:abstractNumId w:val="57"/>
+  <w:num w:numId="57" w16cid:durableId="776488844">
+    <w:abstractNumId w:val="2"/>
   </w:num>
-  <w:num w:numId="27" w16cid:durableId="1896968251">
+  <w:num w:numId="58" w16cid:durableId="682974461">
+    <w:abstractNumId w:val="5"/>
+  </w:num>
+  <w:num w:numId="59" w16cid:durableId="17003977">
     <w:abstractNumId w:val="12"/>
   </w:num>
-  <w:num w:numId="28" w16cid:durableId="791751936">
-    <w:abstractNumId w:val="45"/>
+  <w:num w:numId="60" w16cid:durableId="109905482">
+    <w:abstractNumId w:val="60"/>
   </w:num>
-  <w:num w:numId="29" w16cid:durableId="2093428565">
-    <w:abstractNumId w:val="13"/>
-  </w:num>
-  <w:num w:numId="30" w16cid:durableId="1461802735">
-    <w:abstractNumId w:val="6"/>
-  </w:num>
-  <w:num w:numId="31" w16cid:durableId="500049884">
-    <w:abstractNumId w:val="35"/>
-  </w:num>
-  <w:num w:numId="32" w16cid:durableId="1257860979">
-    <w:abstractNumId w:val="40"/>
-  </w:num>
-  <w:num w:numId="33" w16cid:durableId="1856532754">
-    <w:abstractNumId w:val="37"/>
-  </w:num>
-  <w:num w:numId="34" w16cid:durableId="670717859">
-    <w:abstractNumId w:val="2"/>
-  </w:num>
-  <w:num w:numId="35" w16cid:durableId="33429240">
-    <w:abstractNumId w:val="29"/>
-  </w:num>
-  <w:num w:numId="36" w16cid:durableId="840660728">
-    <w:abstractNumId w:val="38"/>
-  </w:num>
-  <w:num w:numId="37" w16cid:durableId="752552443">
-    <w:abstractNumId w:val="39"/>
-  </w:num>
-  <w:num w:numId="38" w16cid:durableId="1891113332">
-    <w:abstractNumId w:val="9"/>
-  </w:num>
-  <w:num w:numId="39" w16cid:durableId="1012100508">
-    <w:abstractNumId w:val="14"/>
-  </w:num>
-  <w:num w:numId="40" w16cid:durableId="733747314">
-    <w:abstractNumId w:val="25"/>
-  </w:num>
-  <w:num w:numId="41" w16cid:durableId="1615207630">
-    <w:abstractNumId w:val="56"/>
-  </w:num>
-  <w:num w:numId="42" w16cid:durableId="1209685121">
-    <w:abstractNumId w:val="21"/>
-  </w:num>
-  <w:num w:numId="43" w16cid:durableId="1432508296">
-    <w:abstractNumId w:val="7"/>
-  </w:num>
-  <w:num w:numId="44" w16cid:durableId="1671713202">
-    <w:abstractNumId w:val="36"/>
-  </w:num>
-  <w:num w:numId="45" w16cid:durableId="558441367">
-    <w:abstractNumId w:val="52"/>
-  </w:num>
-  <w:num w:numId="46" w16cid:durableId="1301769755">
-    <w:abstractNumId w:val="5"/>
-  </w:num>
-  <w:num w:numId="47" w16cid:durableId="1255700740">
-    <w:abstractNumId w:val="41"/>
-  </w:num>
-  <w:num w:numId="48" w16cid:durableId="1613516090">
-    <w:abstractNumId w:val="50"/>
-  </w:num>
-  <w:num w:numId="49" w16cid:durableId="1287657885">
-    <w:abstractNumId w:val="49"/>
-  </w:num>
-  <w:num w:numId="50" w16cid:durableId="465047122">
-    <w:abstractNumId w:val="33"/>
-  </w:num>
-  <w:num w:numId="51" w16cid:durableId="421881451">
-    <w:abstractNumId w:val="3"/>
-  </w:num>
-  <w:num w:numId="52" w16cid:durableId="1944459059">
-    <w:abstractNumId w:val="47"/>
-  </w:num>
-  <w:num w:numId="53" w16cid:durableId="2013679682">
-    <w:abstractNumId w:val="17"/>
-  </w:num>
-  <w:num w:numId="54" w16cid:durableId="2054498748">
-    <w:abstractNumId w:val="20"/>
-  </w:num>
-  <w:num w:numId="55" w16cid:durableId="1921984355">
-    <w:abstractNumId w:val="31"/>
-  </w:num>
-  <w:num w:numId="56" w16cid:durableId="1866945447">
-    <w:abstractNumId w:val="30"/>
-  </w:num>
-  <w:num w:numId="57" w16cid:durableId="776488844">
-    <w:abstractNumId w:val="1"/>
-  </w:num>
-  <w:num w:numId="58" w16cid:durableId="682974461">
-    <w:abstractNumId w:val="4"/>
-  </w:num>
-  <w:num w:numId="59" w16cid:durableId="17003977">
-    <w:abstractNumId w:val="11"/>
-  </w:num>
-  <w:num w:numId="60" w16cid:durableId="109905482">
-    <w:abstractNumId w:val="59"/>
+  <w:num w:numId="61" w16cid:durableId="1480269496">
+    <w:abstractNumId w:val="0"/>
   </w:num>
 </w:numbering>
 </file>

</xml_diff>